<commit_message>
Align current and milestone control with scoring
</commit_message>
<xml_diff>
--- a/release/printable/Рабочая_программа_Б1.В.05.docx
+++ b/release/printable/Рабочая_программа_Б1.В.05.docx
@@ -498,7 +498,7 @@
           <w:color w:val="5B6570"/>
           <w:sz w:val="20"/>
         </w:rPr>
-        <w:t>Редакция 1.3  •  2026</w:t>
+        <w:t>Редакция 1.4  •  2026</w:t>
       </w:r>
       <w:r>
         <w:br w:type="page"/>
@@ -4484,7 +4484,7 @@
                 <w:b w:val="0"/>
                 <w:sz w:val="20"/>
               </w:rPr>
-              <w:t>10</w:t>
+              <w:t>8</w:t>
             </w:r>
           </w:p>
         </w:tc>
@@ -4527,7 +4527,7 @@
                 <w:b w:val="0"/>
                 <w:sz w:val="20"/>
               </w:rPr>
-              <w:t>10</w:t>
+              <w:t>8</w:t>
             </w:r>
           </w:p>
         </w:tc>
@@ -4570,7 +4570,7 @@
                 <w:b w:val="0"/>
                 <w:sz w:val="20"/>
               </w:rPr>
-              <w:t>12</w:t>
+              <w:t>8</w:t>
             </w:r>
           </w:p>
         </w:tc>
@@ -4613,7 +4613,7 @@
                 <w:b w:val="0"/>
                 <w:sz w:val="20"/>
               </w:rPr>
-              <w:t>10</w:t>
+              <w:t>8</w:t>
             </w:r>
           </w:p>
         </w:tc>
@@ -4656,7 +4656,50 @@
                 <w:b w:val="0"/>
                 <w:sz w:val="20"/>
               </w:rPr>
-              <w:t>10</w:t>
+              <w:t>8</w:t>
+            </w:r>
+          </w:p>
+        </w:tc>
+      </w:tr>
+      <w:tr>
+        <w:trPr>
+          <w:cantSplit/>
+        </w:trPr>
+        <w:tc>
+          <w:tcPr>
+            <w:tcW w:type="dxa" w:w="7638"/>
+          </w:tcPr>
+          <w:p>
+            <w:pPr>
+              <w:spacing w:before="0" w:after="0" w:line="252" w:lineRule="auto"/>
+              <w:jc w:val="left"/>
+            </w:pPr>
+            <w:r>
+              <w:rPr>
+                <w:rFonts w:ascii="Arial" w:hAnsi="Arial" w:eastAsia="Arial"/>
+                <w:b w:val="0"/>
+                <w:sz w:val="20"/>
+              </w:rPr>
+              <w:t>Текущий и рубежный контроль</w:t>
+            </w:r>
+          </w:p>
+        </w:tc>
+        <w:tc>
+          <w:tcPr>
+            <w:tcW w:type="dxa" w:w="2000"/>
+          </w:tcPr>
+          <w:p>
+            <w:pPr>
+              <w:spacing w:before="0" w:after="0" w:line="252" w:lineRule="auto"/>
+              <w:jc w:val="center"/>
+            </w:pPr>
+            <w:r>
+              <w:rPr>
+                <w:rFonts w:ascii="Arial" w:hAnsi="Arial" w:eastAsia="Arial"/>
+                <w:b w:val="0"/>
+                <w:sz w:val="20"/>
+              </w:rPr>
+              <w:t>12</w:t>
             </w:r>
           </w:p>
         </w:tc>
@@ -4842,6 +4885,11 @@
       </w:pPr>
     </w:p>
     <w:p>
+      <w:r>
+        <w:t>Единое средство «Текущий и рубежный контроль» включает до 6 баллов за три тематические текущие проверки и до 6 баллов за два рубежных контроля. Входная диагностика в итоговую сумму не включается.</w:t>
+      </w:r>
+    </w:p>
+    <w:p>
       <w:pPr>
         <w:pStyle w:val="Heading2"/>
       </w:pPr>
@@ -4925,7 +4973,7 @@
         <w:pStyle w:val="ListBullet"/>
       </w:pPr>
       <w:r>
-        <w:t>текущие вопросы и мини-задания;</w:t>
+        <w:t>текущие вопросы, мини-задания и рубежный контроль — единое оценочное средство весом 12 баллов;</w:t>
       </w:r>
     </w:p>
     <w:p>
@@ -4934,14 +4982,6 @@
       </w:pPr>
       <w:r>
         <w:t>лабораторные работы;</w:t>
-      </w:r>
-    </w:p>
-    <w:p>
-      <w:pPr>
-        <w:pStyle w:val="ListBullet"/>
-      </w:pPr>
-      <w:r>
-        <w:t>рубежный контроль по данным и сравнению моделей;</w:t>
       </w:r>
     </w:p>
     <w:p>

</xml_diff>

<commit_message>
Add competency levels to course structure
</commit_message>
<xml_diff>
--- a/release/printable/Рабочая_программа_Б1.В.05.docx
+++ b/release/printable/Рабочая_программа_Б1.В.05.docx
@@ -498,7 +498,7 @@
           <w:color w:val="5B6570"/>
           <w:sz w:val="20"/>
         </w:rPr>
-        <w:t>Редакция 1.4  •  2026</w:t>
+        <w:t>Редакция 1.5  •  2026</w:t>
       </w:r>
       <w:r>
         <w:br w:type="page"/>
@@ -1866,103 +1866,20 @@
         </w:tblBorders>
       </w:tblPr>
       <w:tblGrid>
-        <w:gridCol w:w="420"/>
-        <w:gridCol w:w="4300"/>
-        <w:gridCol w:w="750"/>
         <w:gridCol w:w="500"/>
-        <w:gridCol w:w="500"/>
-        <w:gridCol w:w="650"/>
-        <w:gridCol w:w="2518"/>
+        <w:gridCol w:w="3330"/>
+        <w:gridCol w:w="700"/>
+        <w:gridCol w:w="430"/>
+        <w:gridCol w:w="480"/>
+        <w:gridCol w:w="600"/>
+        <w:gridCol w:w="2448"/>
+        <w:gridCol w:w="1150"/>
       </w:tblGrid>
       <w:tr>
         <w:trPr>
           <w:cantSplit/>
           <w:tblHeader w:val="true"/>
         </w:trPr>
-        <w:tc>
-          <w:tcPr>
-            <w:tcW w:type="dxa" w:w="420"/>
-            <w:tcMar>
-              <w:top w:w="80" w:type="dxa"/>
-              <w:bottom w:w="80" w:type="dxa"/>
-              <w:start w:w="120" w:type="dxa"/>
-              <w:end w:w="120" w:type="dxa"/>
-            </w:tcMar>
-            <w:vAlign w:val="center"/>
-            <w:shd w:fill="E8EEF3"/>
-          </w:tcPr>
-          <w:p>
-            <w:pPr>
-              <w:spacing w:before="0" w:after="0" w:line="252" w:lineRule="auto"/>
-              <w:jc w:val="center"/>
-            </w:pPr>
-            <w:r>
-              <w:rPr>
-                <w:rFonts w:ascii="Arial" w:hAnsi="Arial" w:eastAsia="Arial"/>
-                <w:b/>
-                <w:color w:val="173B52"/>
-                <w:sz w:val="16"/>
-              </w:rPr>
-              <w:t>№</w:t>
-            </w:r>
-          </w:p>
-        </w:tc>
-        <w:tc>
-          <w:tcPr>
-            <w:tcW w:type="dxa" w:w="4300"/>
-            <w:tcMar>
-              <w:top w:w="80" w:type="dxa"/>
-              <w:bottom w:w="80" w:type="dxa"/>
-              <w:start w:w="120" w:type="dxa"/>
-              <w:end w:w="120" w:type="dxa"/>
-            </w:tcMar>
-            <w:vAlign w:val="center"/>
-            <w:shd w:fill="E8EEF3"/>
-          </w:tcPr>
-          <w:p>
-            <w:pPr>
-              <w:spacing w:before="0" w:after="0" w:line="252" w:lineRule="auto"/>
-              <w:jc w:val="left"/>
-            </w:pPr>
-            <w:r>
-              <w:rPr>
-                <w:rFonts w:ascii="Arial" w:hAnsi="Arial" w:eastAsia="Arial"/>
-                <w:b/>
-                <w:color w:val="173B52"/>
-                <w:sz w:val="16"/>
-              </w:rPr>
-              <w:t>Раздел или тема</w:t>
-            </w:r>
-          </w:p>
-        </w:tc>
-        <w:tc>
-          <w:tcPr>
-            <w:tcW w:type="dxa" w:w="750"/>
-            <w:tcMar>
-              <w:top w:w="80" w:type="dxa"/>
-              <w:bottom w:w="80" w:type="dxa"/>
-              <w:start w:w="120" w:type="dxa"/>
-              <w:end w:w="120" w:type="dxa"/>
-            </w:tcMar>
-            <w:vAlign w:val="center"/>
-            <w:shd w:fill="E8EEF3"/>
-          </w:tcPr>
-          <w:p>
-            <w:pPr>
-              <w:spacing w:before="0" w:after="0" w:line="252" w:lineRule="auto"/>
-              <w:jc w:val="center"/>
-            </w:pPr>
-            <w:r>
-              <w:rPr>
-                <w:rFonts w:ascii="Arial" w:hAnsi="Arial" w:eastAsia="Arial"/>
-                <w:b/>
-                <w:color w:val="173B52"/>
-                <w:sz w:val="16"/>
-              </w:rPr>
-              <w:t>Всего</w:t>
-            </w:r>
-          </w:p>
-        </w:tc>
         <w:tc>
           <w:tcPr>
             <w:tcW w:type="dxa" w:w="500"/>
@@ -1985,15 +1902,43 @@
                 <w:rFonts w:ascii="Arial" w:hAnsi="Arial" w:eastAsia="Arial"/>
                 <w:b/>
                 <w:color w:val="173B52"/>
-                <w:sz w:val="16"/>
+                <w:sz w:val="15"/>
               </w:rPr>
-              <w:t>Л</w:t>
+              <w:t>№</w:t>
             </w:r>
           </w:p>
         </w:tc>
         <w:tc>
           <w:tcPr>
-            <w:tcW w:type="dxa" w:w="500"/>
+            <w:tcW w:type="dxa" w:w="3330"/>
+            <w:tcMar>
+              <w:top w:w="80" w:type="dxa"/>
+              <w:bottom w:w="80" w:type="dxa"/>
+              <w:start w:w="120" w:type="dxa"/>
+              <w:end w:w="120" w:type="dxa"/>
+            </w:tcMar>
+            <w:vAlign w:val="center"/>
+            <w:shd w:fill="E8EEF3"/>
+          </w:tcPr>
+          <w:p>
+            <w:pPr>
+              <w:spacing w:before="0" w:after="0" w:line="252" w:lineRule="auto"/>
+              <w:jc w:val="left"/>
+            </w:pPr>
+            <w:r>
+              <w:rPr>
+                <w:rFonts w:ascii="Arial" w:hAnsi="Arial" w:eastAsia="Arial"/>
+                <w:b/>
+                <w:color w:val="173B52"/>
+                <w:sz w:val="15"/>
+              </w:rPr>
+              <w:t>Раздел или тема</w:t>
+            </w:r>
+          </w:p>
+        </w:tc>
+        <w:tc>
+          <w:tcPr>
+            <w:tcW w:type="dxa" w:w="700"/>
             <w:tcMar>
               <w:top w:w="80" w:type="dxa"/>
               <w:bottom w:w="80" w:type="dxa"/>
@@ -2013,15 +1958,15 @@
                 <w:rFonts w:ascii="Arial" w:hAnsi="Arial" w:eastAsia="Arial"/>
                 <w:b/>
                 <w:color w:val="173B52"/>
-                <w:sz w:val="16"/>
+                <w:sz w:val="15"/>
               </w:rPr>
-              <w:t>ЛР</w:t>
+              <w:t>Всего</w:t>
             </w:r>
           </w:p>
         </w:tc>
         <w:tc>
           <w:tcPr>
-            <w:tcW w:type="dxa" w:w="650"/>
+            <w:tcW w:type="dxa" w:w="430"/>
             <w:tcMar>
               <w:top w:w="80" w:type="dxa"/>
               <w:bottom w:w="80" w:type="dxa"/>
@@ -2041,15 +1986,15 @@
                 <w:rFonts w:ascii="Arial" w:hAnsi="Arial" w:eastAsia="Arial"/>
                 <w:b/>
                 <w:color w:val="173B52"/>
-                <w:sz w:val="16"/>
+                <w:sz w:val="15"/>
               </w:rPr>
-              <w:t>СРС</w:t>
+              <w:t>Л</w:t>
             </w:r>
           </w:p>
         </w:tc>
         <w:tc>
           <w:tcPr>
-            <w:tcW w:type="dxa" w:w="2518"/>
+            <w:tcW w:type="dxa" w:w="480"/>
             <w:tcMar>
               <w:top w:w="80" w:type="dxa"/>
               <w:bottom w:w="80" w:type="dxa"/>
@@ -2062,27 +2007,30 @@
           <w:p>
             <w:pPr>
               <w:spacing w:before="0" w:after="0" w:line="252" w:lineRule="auto"/>
-              <w:jc w:val="left"/>
+              <w:jc w:val="center"/>
             </w:pPr>
             <w:r>
               <w:rPr>
                 <w:rFonts w:ascii="Arial" w:hAnsi="Arial" w:eastAsia="Arial"/>
                 <w:b/>
                 <w:color w:val="173B52"/>
-                <w:sz w:val="16"/>
+                <w:sz w:val="15"/>
               </w:rPr>
-              <w:t>Индикаторы</w:t>
+              <w:t>ЛР</w:t>
             </w:r>
           </w:p>
         </w:tc>
-      </w:tr>
-      <w:tr>
-        <w:trPr>
-          <w:cantSplit/>
-        </w:trPr>
         <w:tc>
           <w:tcPr>
-            <w:tcW w:type="dxa" w:w="420"/>
+            <w:tcW w:type="dxa" w:w="600"/>
+            <w:tcMar>
+              <w:top w:w="80" w:type="dxa"/>
+              <w:bottom w:w="80" w:type="dxa"/>
+              <w:start w:w="120" w:type="dxa"/>
+              <w:end w:w="120" w:type="dxa"/>
+            </w:tcMar>
+            <w:vAlign w:val="center"/>
+            <w:shd w:fill="E8EEF3"/>
           </w:tcPr>
           <w:p>
             <w:pPr>
@@ -2092,35 +2040,25 @@
             <w:r>
               <w:rPr>
                 <w:rFonts w:ascii="Arial" w:hAnsi="Arial" w:eastAsia="Arial"/>
-                <w:b w:val="0"/>
-                <w:sz w:val="16"/>
+                <w:b/>
+                <w:color w:val="173B52"/>
+                <w:sz w:val="15"/>
               </w:rPr>
-              <w:t>1</w:t>
+              <w:t>СРС</w:t>
             </w:r>
           </w:p>
         </w:tc>
         <w:tc>
           <w:tcPr>
-            <w:tcW w:type="dxa" w:w="4300"/>
-          </w:tcPr>
-          <w:p>
-            <w:pPr>
-              <w:spacing w:before="0" w:after="0" w:line="252" w:lineRule="auto"/>
-              <w:jc w:val="left"/>
-            </w:pPr>
-            <w:r>
-              <w:rPr>
-                <w:rFonts w:ascii="Arial" w:hAnsi="Arial" w:eastAsia="Arial"/>
-                <w:b w:val="0"/>
-                <w:sz w:val="16"/>
-              </w:rPr>
-              <w:t>Постановка задачи классификации, типы признаков и этапы решения</w:t>
-            </w:r>
-          </w:p>
-        </w:tc>
-        <w:tc>
-          <w:tcPr>
-            <w:tcW w:type="dxa" w:w="750"/>
+            <w:tcW w:type="dxa" w:w="2448"/>
+            <w:tcMar>
+              <w:top w:w="80" w:type="dxa"/>
+              <w:bottom w:w="80" w:type="dxa"/>
+              <w:start w:w="120" w:type="dxa"/>
+              <w:end w:w="120" w:type="dxa"/>
+            </w:tcMar>
+            <w:vAlign w:val="center"/>
+            <w:shd w:fill="E8EEF3"/>
           </w:tcPr>
           <w:p>
             <w:pPr>
@@ -2130,13 +2068,47 @@
             <w:r>
               <w:rPr>
                 <w:rFonts w:ascii="Arial" w:hAnsi="Arial" w:eastAsia="Arial"/>
-                <w:b w:val="0"/>
-                <w:sz w:val="16"/>
+                <w:b/>
+                <w:color w:val="173B52"/>
+                <w:sz w:val="15"/>
               </w:rPr>
-              <w:t>6</w:t>
+              <w:t>Индикаторы</w:t>
             </w:r>
           </w:p>
         </w:tc>
+        <w:tc>
+          <w:tcPr>
+            <w:tcW w:type="dxa" w:w="1150"/>
+            <w:tcMar>
+              <w:top w:w="80" w:type="dxa"/>
+              <w:bottom w:w="80" w:type="dxa"/>
+              <w:start w:w="120" w:type="dxa"/>
+              <w:end w:w="120" w:type="dxa"/>
+            </w:tcMar>
+            <w:vAlign w:val="center"/>
+            <w:shd w:fill="E8EEF3"/>
+          </w:tcPr>
+          <w:p>
+            <w:pPr>
+              <w:spacing w:before="0" w:after="0" w:line="252" w:lineRule="auto"/>
+              <w:jc w:val="center"/>
+            </w:pPr>
+            <w:r>
+              <w:rPr>
+                <w:rFonts w:ascii="Arial" w:hAnsi="Arial" w:eastAsia="Arial"/>
+                <w:b/>
+                <w:color w:val="173B52"/>
+                <w:sz w:val="15"/>
+              </w:rPr>
+              <w:t>Уровень</w:t>
+            </w:r>
+          </w:p>
+        </w:tc>
+      </w:tr>
+      <w:tr>
+        <w:trPr>
+          <w:cantSplit/>
+        </w:trPr>
         <w:tc>
           <w:tcPr>
             <w:tcW w:type="dxa" w:w="500"/>
@@ -2150,12 +2122,154 @@
               <w:rPr>
                 <w:rFonts w:ascii="Arial" w:hAnsi="Arial" w:eastAsia="Arial"/>
                 <w:b w:val="0"/>
-                <w:sz w:val="16"/>
+                <w:sz w:val="15"/>
+              </w:rPr>
+              <w:t>1</w:t>
+            </w:r>
+          </w:p>
+        </w:tc>
+        <w:tc>
+          <w:tcPr>
+            <w:tcW w:type="dxa" w:w="3330"/>
+          </w:tcPr>
+          <w:p>
+            <w:pPr>
+              <w:spacing w:before="0" w:after="0" w:line="252" w:lineRule="auto"/>
+              <w:jc w:val="left"/>
+            </w:pPr>
+            <w:r>
+              <w:rPr>
+                <w:rFonts w:ascii="Arial" w:hAnsi="Arial" w:eastAsia="Arial"/>
+                <w:b w:val="0"/>
+                <w:sz w:val="15"/>
+              </w:rPr>
+              <w:t>Постановка задачи классификации, типы признаков и этапы решения</w:t>
+            </w:r>
+          </w:p>
+        </w:tc>
+        <w:tc>
+          <w:tcPr>
+            <w:tcW w:type="dxa" w:w="700"/>
+          </w:tcPr>
+          <w:p>
+            <w:pPr>
+              <w:spacing w:before="0" w:after="0" w:line="252" w:lineRule="auto"/>
+              <w:jc w:val="center"/>
+            </w:pPr>
+            <w:r>
+              <w:rPr>
+                <w:rFonts w:ascii="Arial" w:hAnsi="Arial" w:eastAsia="Arial"/>
+                <w:b w:val="0"/>
+                <w:sz w:val="15"/>
+              </w:rPr>
+              <w:t>6</w:t>
+            </w:r>
+          </w:p>
+        </w:tc>
+        <w:tc>
+          <w:tcPr>
+            <w:tcW w:type="dxa" w:w="430"/>
+          </w:tcPr>
+          <w:p>
+            <w:pPr>
+              <w:spacing w:before="0" w:after="0" w:line="252" w:lineRule="auto"/>
+              <w:jc w:val="center"/>
+            </w:pPr>
+            <w:r>
+              <w:rPr>
+                <w:rFonts w:ascii="Arial" w:hAnsi="Arial" w:eastAsia="Arial"/>
+                <w:b w:val="0"/>
+                <w:sz w:val="15"/>
               </w:rPr>
               <w:t>2</w:t>
             </w:r>
           </w:p>
         </w:tc>
+        <w:tc>
+          <w:tcPr>
+            <w:tcW w:type="dxa" w:w="480"/>
+          </w:tcPr>
+          <w:p>
+            <w:pPr>
+              <w:spacing w:before="0" w:after="0" w:line="252" w:lineRule="auto"/>
+              <w:jc w:val="center"/>
+            </w:pPr>
+            <w:r>
+              <w:rPr>
+                <w:rFonts w:ascii="Arial" w:hAnsi="Arial" w:eastAsia="Arial"/>
+                <w:b w:val="0"/>
+                <w:sz w:val="15"/>
+              </w:rPr>
+              <w:t>2</w:t>
+            </w:r>
+          </w:p>
+        </w:tc>
+        <w:tc>
+          <w:tcPr>
+            <w:tcW w:type="dxa" w:w="600"/>
+          </w:tcPr>
+          <w:p>
+            <w:pPr>
+              <w:spacing w:before="0" w:after="0" w:line="252" w:lineRule="auto"/>
+              <w:jc w:val="center"/>
+            </w:pPr>
+            <w:r>
+              <w:rPr>
+                <w:rFonts w:ascii="Arial" w:hAnsi="Arial" w:eastAsia="Arial"/>
+                <w:b w:val="0"/>
+                <w:sz w:val="15"/>
+              </w:rPr>
+              <w:t>2</w:t>
+            </w:r>
+          </w:p>
+        </w:tc>
+        <w:tc>
+          <w:tcPr>
+            <w:tcW w:type="dxa" w:w="2448"/>
+          </w:tcPr>
+          <w:p>
+            <w:pPr>
+              <w:spacing w:before="0" w:after="0" w:line="252" w:lineRule="auto"/>
+              <w:jc w:val="center"/>
+            </w:pPr>
+            <w:r>
+              <w:rPr>
+                <w:rFonts w:ascii="Arial" w:hAnsi="Arial" w:eastAsia="Arial"/>
+                <w:b w:val="0"/>
+                <w:sz w:val="15"/>
+              </w:rPr>
+              <w:t>ML-2.1</w:t>
+              <w:br/>
+              <w:t>ML-2.2</w:t>
+            </w:r>
+          </w:p>
+        </w:tc>
+        <w:tc>
+          <w:tcPr>
+            <w:tcW w:type="dxa" w:w="1150"/>
+          </w:tcPr>
+          <w:p>
+            <w:pPr>
+              <w:spacing w:before="0" w:after="0" w:line="252" w:lineRule="auto"/>
+              <w:jc w:val="center"/>
+            </w:pPr>
+            <w:r>
+              <w:rPr>
+                <w:rFonts w:ascii="Arial" w:hAnsi="Arial" w:eastAsia="Arial"/>
+                <w:b w:val="0"/>
+                <w:sz w:val="15"/>
+              </w:rPr>
+              <w:t>Б</w:t>
+              <w:br/>
+              <w:t>Б</w:t>
+            </w:r>
+          </w:p>
+        </w:tc>
+      </w:tr>
+      <w:tr>
+        <w:trPr>
+          <w:cantSplit/>
+        </w:trPr>
         <w:tc>
           <w:tcPr>
             <w:tcW w:type="dxa" w:w="500"/>
@@ -2169,7 +2283,7 @@
               <w:rPr>
                 <w:rFonts w:ascii="Arial" w:hAnsi="Arial" w:eastAsia="Arial"/>
                 <w:b w:val="0"/>
-                <w:sz w:val="16"/>
+                <w:sz w:val="15"/>
               </w:rPr>
               <w:t>2</w:t>
             </w:r>
@@ -2177,7 +2291,26 @@
         </w:tc>
         <w:tc>
           <w:tcPr>
-            <w:tcW w:type="dxa" w:w="650"/>
+            <w:tcW w:type="dxa" w:w="3330"/>
+          </w:tcPr>
+          <w:p>
+            <w:pPr>
+              <w:spacing w:before="0" w:after="0" w:line="252" w:lineRule="auto"/>
+              <w:jc w:val="left"/>
+            </w:pPr>
+            <w:r>
+              <w:rPr>
+                <w:rFonts w:ascii="Arial" w:hAnsi="Arial" w:eastAsia="Arial"/>
+                <w:b w:val="0"/>
+                <w:sz w:val="15"/>
+              </w:rPr>
+              <w:t>Метрики, матрица ошибок, ROC/PR, кросс-валидация</w:t>
+            </w:r>
+          </w:p>
+        </w:tc>
+        <w:tc>
+          <w:tcPr>
+            <w:tcW w:type="dxa" w:w="700"/>
           </w:tcPr>
           <w:p>
             <w:pPr>
@@ -2188,39 +2321,15 @@
               <w:rPr>
                 <w:rFonts w:ascii="Arial" w:hAnsi="Arial" w:eastAsia="Arial"/>
                 <w:b w:val="0"/>
-                <w:sz w:val="16"/>
+                <w:sz w:val="15"/>
               </w:rPr>
-              <w:t>2</w:t>
+              <w:t>6</w:t>
             </w:r>
           </w:p>
         </w:tc>
         <w:tc>
           <w:tcPr>
-            <w:tcW w:type="dxa" w:w="2518"/>
-          </w:tcPr>
-          <w:p>
-            <w:pPr>
-              <w:spacing w:before="0" w:after="0" w:line="252" w:lineRule="auto"/>
-              <w:jc w:val="left"/>
-            </w:pPr>
-            <w:r>
-              <w:rPr>
-                <w:rFonts w:ascii="Arial" w:hAnsi="Arial" w:eastAsia="Arial"/>
-                <w:b w:val="0"/>
-                <w:sz w:val="16"/>
-              </w:rPr>
-              <w:t>ML-2.1, ML-2.2</w:t>
-            </w:r>
-          </w:p>
-        </w:tc>
-      </w:tr>
-      <w:tr>
-        <w:trPr>
-          <w:cantSplit/>
-        </w:trPr>
-        <w:tc>
-          <w:tcPr>
-            <w:tcW w:type="dxa" w:w="420"/>
+            <w:tcW w:type="dxa" w:w="430"/>
           </w:tcPr>
           <w:p>
             <w:pPr>
@@ -2231,7 +2340,7 @@
               <w:rPr>
                 <w:rFonts w:ascii="Arial" w:hAnsi="Arial" w:eastAsia="Arial"/>
                 <w:b w:val="0"/>
-                <w:sz w:val="16"/>
+                <w:sz w:val="15"/>
               </w:rPr>
               <w:t>2</w:t>
             </w:r>
@@ -2239,26 +2348,7 @@
         </w:tc>
         <w:tc>
           <w:tcPr>
-            <w:tcW w:type="dxa" w:w="4300"/>
-          </w:tcPr>
-          <w:p>
-            <w:pPr>
-              <w:spacing w:before="0" w:after="0" w:line="252" w:lineRule="auto"/>
-              <w:jc w:val="left"/>
-            </w:pPr>
-            <w:r>
-              <w:rPr>
-                <w:rFonts w:ascii="Arial" w:hAnsi="Arial" w:eastAsia="Arial"/>
-                <w:b w:val="0"/>
-                <w:sz w:val="16"/>
-              </w:rPr>
-              <w:t>Метрики, матрица ошибок, ROC/PR, кросс-валидация</w:t>
-            </w:r>
-          </w:p>
-        </w:tc>
-        <w:tc>
-          <w:tcPr>
-            <w:tcW w:type="dxa" w:w="750"/>
+            <w:tcW w:type="dxa" w:w="480"/>
           </w:tcPr>
           <w:p>
             <w:pPr>
@@ -2269,12 +2359,74 @@
               <w:rPr>
                 <w:rFonts w:ascii="Arial" w:hAnsi="Arial" w:eastAsia="Arial"/>
                 <w:b w:val="0"/>
-                <w:sz w:val="16"/>
+                <w:sz w:val="15"/>
               </w:rPr>
-              <w:t>6</w:t>
+              <w:t>2</w:t>
             </w:r>
           </w:p>
         </w:tc>
+        <w:tc>
+          <w:tcPr>
+            <w:tcW w:type="dxa" w:w="600"/>
+          </w:tcPr>
+          <w:p>
+            <w:pPr>
+              <w:spacing w:before="0" w:after="0" w:line="252" w:lineRule="auto"/>
+              <w:jc w:val="center"/>
+            </w:pPr>
+            <w:r>
+              <w:rPr>
+                <w:rFonts w:ascii="Arial" w:hAnsi="Arial" w:eastAsia="Arial"/>
+                <w:b w:val="0"/>
+                <w:sz w:val="15"/>
+              </w:rPr>
+              <w:t>2</w:t>
+            </w:r>
+          </w:p>
+        </w:tc>
+        <w:tc>
+          <w:tcPr>
+            <w:tcW w:type="dxa" w:w="2448"/>
+          </w:tcPr>
+          <w:p>
+            <w:pPr>
+              <w:spacing w:before="0" w:after="0" w:line="252" w:lineRule="auto"/>
+              <w:jc w:val="center"/>
+            </w:pPr>
+            <w:r>
+              <w:rPr>
+                <w:rFonts w:ascii="Arial" w:hAnsi="Arial" w:eastAsia="Arial"/>
+                <w:b w:val="0"/>
+                <w:sz w:val="15"/>
+              </w:rPr>
+              <w:t>ML-2.3</w:t>
+            </w:r>
+          </w:p>
+        </w:tc>
+        <w:tc>
+          <w:tcPr>
+            <w:tcW w:type="dxa" w:w="1150"/>
+          </w:tcPr>
+          <w:p>
+            <w:pPr>
+              <w:spacing w:before="0" w:after="0" w:line="252" w:lineRule="auto"/>
+              <w:jc w:val="center"/>
+            </w:pPr>
+            <w:r>
+              <w:rPr>
+                <w:rFonts w:ascii="Arial" w:hAnsi="Arial" w:eastAsia="Arial"/>
+                <w:b w:val="0"/>
+                <w:sz w:val="15"/>
+              </w:rPr>
+              <w:t>С</w:t>
+            </w:r>
+          </w:p>
+        </w:tc>
+      </w:tr>
+      <w:tr>
+        <w:trPr>
+          <w:cantSplit/>
+        </w:trPr>
         <w:tc>
           <w:tcPr>
             <w:tcW w:type="dxa" w:w="500"/>
@@ -2288,12 +2440,154 @@
               <w:rPr>
                 <w:rFonts w:ascii="Arial" w:hAnsi="Arial" w:eastAsia="Arial"/>
                 <w:b w:val="0"/>
-                <w:sz w:val="16"/>
+                <w:sz w:val="15"/>
               </w:rPr>
-              <w:t>2</w:t>
+              <w:t>3</w:t>
             </w:r>
           </w:p>
         </w:tc>
+        <w:tc>
+          <w:tcPr>
+            <w:tcW w:type="dxa" w:w="3330"/>
+          </w:tcPr>
+          <w:p>
+            <w:pPr>
+              <w:spacing w:before="0" w:after="0" w:line="252" w:lineRule="auto"/>
+              <w:jc w:val="left"/>
+            </w:pPr>
+            <w:r>
+              <w:rPr>
+                <w:rFonts w:ascii="Arial" w:hAnsi="Arial" w:eastAsia="Arial"/>
+                <w:b w:val="0"/>
+                <w:sz w:val="15"/>
+              </w:rPr>
+              <w:t>Логистическая регрессия и регуляризация</w:t>
+            </w:r>
+          </w:p>
+        </w:tc>
+        <w:tc>
+          <w:tcPr>
+            <w:tcW w:type="dxa" w:w="700"/>
+          </w:tcPr>
+          <w:p>
+            <w:pPr>
+              <w:spacing w:before="0" w:after="0" w:line="252" w:lineRule="auto"/>
+              <w:jc w:val="center"/>
+            </w:pPr>
+            <w:r>
+              <w:rPr>
+                <w:rFonts w:ascii="Arial" w:hAnsi="Arial" w:eastAsia="Arial"/>
+                <w:b w:val="0"/>
+                <w:sz w:val="15"/>
+              </w:rPr>
+              <w:t>6</w:t>
+            </w:r>
+          </w:p>
+        </w:tc>
+        <w:tc>
+          <w:tcPr>
+            <w:tcW w:type="dxa" w:w="430"/>
+          </w:tcPr>
+          <w:p>
+            <w:pPr>
+              <w:spacing w:before="0" w:after="0" w:line="252" w:lineRule="auto"/>
+              <w:jc w:val="center"/>
+            </w:pPr>
+            <w:r>
+              <w:rPr>
+                <w:rFonts w:ascii="Arial" w:hAnsi="Arial" w:eastAsia="Arial"/>
+                <w:b w:val="0"/>
+                <w:sz w:val="15"/>
+              </w:rPr>
+              <w:t>1</w:t>
+            </w:r>
+          </w:p>
+        </w:tc>
+        <w:tc>
+          <w:tcPr>
+            <w:tcW w:type="dxa" w:w="480"/>
+          </w:tcPr>
+          <w:p>
+            <w:pPr>
+              <w:spacing w:before="0" w:after="0" w:line="252" w:lineRule="auto"/>
+              <w:jc w:val="center"/>
+            </w:pPr>
+            <w:r>
+              <w:rPr>
+                <w:rFonts w:ascii="Arial" w:hAnsi="Arial" w:eastAsia="Arial"/>
+                <w:b w:val="0"/>
+                <w:sz w:val="15"/>
+              </w:rPr>
+              <w:t>1</w:t>
+            </w:r>
+          </w:p>
+        </w:tc>
+        <w:tc>
+          <w:tcPr>
+            <w:tcW w:type="dxa" w:w="600"/>
+          </w:tcPr>
+          <w:p>
+            <w:pPr>
+              <w:spacing w:before="0" w:after="0" w:line="252" w:lineRule="auto"/>
+              <w:jc w:val="center"/>
+            </w:pPr>
+            <w:r>
+              <w:rPr>
+                <w:rFonts w:ascii="Arial" w:hAnsi="Arial" w:eastAsia="Arial"/>
+                <w:b w:val="0"/>
+                <w:sz w:val="15"/>
+              </w:rPr>
+              <w:t>4</w:t>
+            </w:r>
+          </w:p>
+        </w:tc>
+        <w:tc>
+          <w:tcPr>
+            <w:tcW w:type="dxa" w:w="2448"/>
+          </w:tcPr>
+          <w:p>
+            <w:pPr>
+              <w:spacing w:before="0" w:after="0" w:line="252" w:lineRule="auto"/>
+              <w:jc w:val="center"/>
+            </w:pPr>
+            <w:r>
+              <w:rPr>
+                <w:rFonts w:ascii="Arial" w:hAnsi="Arial" w:eastAsia="Arial"/>
+                <w:b w:val="0"/>
+                <w:sz w:val="15"/>
+              </w:rPr>
+              <w:t>ML-3.1</w:t>
+              <w:br/>
+              <w:t>ML-3.3</w:t>
+            </w:r>
+          </w:p>
+        </w:tc>
+        <w:tc>
+          <w:tcPr>
+            <w:tcW w:type="dxa" w:w="1150"/>
+          </w:tcPr>
+          <w:p>
+            <w:pPr>
+              <w:spacing w:before="0" w:after="0" w:line="252" w:lineRule="auto"/>
+              <w:jc w:val="center"/>
+            </w:pPr>
+            <w:r>
+              <w:rPr>
+                <w:rFonts w:ascii="Arial" w:hAnsi="Arial" w:eastAsia="Arial"/>
+                <w:b w:val="0"/>
+                <w:sz w:val="15"/>
+              </w:rPr>
+              <w:t>С</w:t>
+              <w:br/>
+              <w:t>С</w:t>
+            </w:r>
+          </w:p>
+        </w:tc>
+      </w:tr>
+      <w:tr>
+        <w:trPr>
+          <w:cantSplit/>
+        </w:trPr>
         <w:tc>
           <w:tcPr>
             <w:tcW w:type="dxa" w:w="500"/>
@@ -2307,15 +2601,34 @@
               <w:rPr>
                 <w:rFonts w:ascii="Arial" w:hAnsi="Arial" w:eastAsia="Arial"/>
                 <w:b w:val="0"/>
-                <w:sz w:val="16"/>
+                <w:sz w:val="15"/>
               </w:rPr>
-              <w:t>2</w:t>
+              <w:t>4</w:t>
             </w:r>
           </w:p>
         </w:tc>
         <w:tc>
           <w:tcPr>
-            <w:tcW w:type="dxa" w:w="650"/>
+            <w:tcW w:type="dxa" w:w="3330"/>
+          </w:tcPr>
+          <w:p>
+            <w:pPr>
+              <w:spacing w:before="0" w:after="0" w:line="252" w:lineRule="auto"/>
+              <w:jc w:val="left"/>
+            </w:pPr>
+            <w:r>
+              <w:rPr>
+                <w:rFonts w:ascii="Arial" w:hAnsi="Arial" w:eastAsia="Arial"/>
+                <w:b w:val="0"/>
+                <w:sz w:val="15"/>
+              </w:rPr>
+              <w:t>SVM, разделяющая гиперплоскость и ядра</w:t>
+            </w:r>
+          </w:p>
+        </w:tc>
+        <w:tc>
+          <w:tcPr>
+            <w:tcW w:type="dxa" w:w="700"/>
           </w:tcPr>
           <w:p>
             <w:pPr>
@@ -2326,39 +2639,15 @@
               <w:rPr>
                 <w:rFonts w:ascii="Arial" w:hAnsi="Arial" w:eastAsia="Arial"/>
                 <w:b w:val="0"/>
-                <w:sz w:val="16"/>
+                <w:sz w:val="15"/>
               </w:rPr>
-              <w:t>2</w:t>
+              <w:t>6</w:t>
             </w:r>
           </w:p>
         </w:tc>
         <w:tc>
           <w:tcPr>
-            <w:tcW w:type="dxa" w:w="2518"/>
-          </w:tcPr>
-          <w:p>
-            <w:pPr>
-              <w:spacing w:before="0" w:after="0" w:line="252" w:lineRule="auto"/>
-              <w:jc w:val="left"/>
-            </w:pPr>
-            <w:r>
-              <w:rPr>
-                <w:rFonts w:ascii="Arial" w:hAnsi="Arial" w:eastAsia="Arial"/>
-                <w:b w:val="0"/>
-                <w:sz w:val="16"/>
-              </w:rPr>
-              <w:t>ML-2.3</w:t>
-            </w:r>
-          </w:p>
-        </w:tc>
-      </w:tr>
-      <w:tr>
-        <w:trPr>
-          <w:cantSplit/>
-        </w:trPr>
-        <w:tc>
-          <w:tcPr>
-            <w:tcW w:type="dxa" w:w="420"/>
+            <w:tcW w:type="dxa" w:w="430"/>
           </w:tcPr>
           <w:p>
             <w:pPr>
@@ -2369,34 +2658,15 @@
               <w:rPr>
                 <w:rFonts w:ascii="Arial" w:hAnsi="Arial" w:eastAsia="Arial"/>
                 <w:b w:val="0"/>
-                <w:sz w:val="16"/>
+                <w:sz w:val="15"/>
               </w:rPr>
-              <w:t>3</w:t>
+              <w:t>1</w:t>
             </w:r>
           </w:p>
         </w:tc>
         <w:tc>
           <w:tcPr>
-            <w:tcW w:type="dxa" w:w="4300"/>
-          </w:tcPr>
-          <w:p>
-            <w:pPr>
-              <w:spacing w:before="0" w:after="0" w:line="252" w:lineRule="auto"/>
-              <w:jc w:val="left"/>
-            </w:pPr>
-            <w:r>
-              <w:rPr>
-                <w:rFonts w:ascii="Arial" w:hAnsi="Arial" w:eastAsia="Arial"/>
-                <w:b w:val="0"/>
-                <w:sz w:val="16"/>
-              </w:rPr>
-              <w:t>Логистическая регрессия и регуляризация</w:t>
-            </w:r>
-          </w:p>
-        </w:tc>
-        <w:tc>
-          <w:tcPr>
-            <w:tcW w:type="dxa" w:w="750"/>
+            <w:tcW w:type="dxa" w:w="480"/>
           </w:tcPr>
           <w:p>
             <w:pPr>
@@ -2407,12 +2677,78 @@
               <w:rPr>
                 <w:rFonts w:ascii="Arial" w:hAnsi="Arial" w:eastAsia="Arial"/>
                 <w:b w:val="0"/>
-                <w:sz w:val="16"/>
+                <w:sz w:val="15"/>
               </w:rPr>
-              <w:t>6</w:t>
+              <w:t>1</w:t>
             </w:r>
           </w:p>
         </w:tc>
+        <w:tc>
+          <w:tcPr>
+            <w:tcW w:type="dxa" w:w="600"/>
+          </w:tcPr>
+          <w:p>
+            <w:pPr>
+              <w:spacing w:before="0" w:after="0" w:line="252" w:lineRule="auto"/>
+              <w:jc w:val="center"/>
+            </w:pPr>
+            <w:r>
+              <w:rPr>
+                <w:rFonts w:ascii="Arial" w:hAnsi="Arial" w:eastAsia="Arial"/>
+                <w:b w:val="0"/>
+                <w:sz w:val="15"/>
+              </w:rPr>
+              <w:t>4</w:t>
+            </w:r>
+          </w:p>
+        </w:tc>
+        <w:tc>
+          <w:tcPr>
+            <w:tcW w:type="dxa" w:w="2448"/>
+          </w:tcPr>
+          <w:p>
+            <w:pPr>
+              <w:spacing w:before="0" w:after="0" w:line="252" w:lineRule="auto"/>
+              <w:jc w:val="center"/>
+            </w:pPr>
+            <w:r>
+              <w:rPr>
+                <w:rFonts w:ascii="Arial" w:hAnsi="Arial" w:eastAsia="Arial"/>
+                <w:b w:val="0"/>
+                <w:sz w:val="15"/>
+              </w:rPr>
+              <w:t>ML-3.1</w:t>
+              <w:br/>
+              <w:t>ML-3.3</w:t>
+            </w:r>
+          </w:p>
+        </w:tc>
+        <w:tc>
+          <w:tcPr>
+            <w:tcW w:type="dxa" w:w="1150"/>
+          </w:tcPr>
+          <w:p>
+            <w:pPr>
+              <w:spacing w:before="0" w:after="0" w:line="252" w:lineRule="auto"/>
+              <w:jc w:val="center"/>
+            </w:pPr>
+            <w:r>
+              <w:rPr>
+                <w:rFonts w:ascii="Arial" w:hAnsi="Arial" w:eastAsia="Arial"/>
+                <w:b w:val="0"/>
+                <w:sz w:val="15"/>
+              </w:rPr>
+              <w:t>С</w:t>
+              <w:br/>
+              <w:t>С</w:t>
+            </w:r>
+          </w:p>
+        </w:tc>
+      </w:tr>
+      <w:tr>
+        <w:trPr>
+          <w:cantSplit/>
+        </w:trPr>
         <w:tc>
           <w:tcPr>
             <w:tcW w:type="dxa" w:w="500"/>
@@ -2426,12 +2762,154 @@
               <w:rPr>
                 <w:rFonts w:ascii="Arial" w:hAnsi="Arial" w:eastAsia="Arial"/>
                 <w:b w:val="0"/>
-                <w:sz w:val="16"/>
+                <w:sz w:val="15"/>
+              </w:rPr>
+              <w:t>5</w:t>
+            </w:r>
+          </w:p>
+        </w:tc>
+        <w:tc>
+          <w:tcPr>
+            <w:tcW w:type="dxa" w:w="3330"/>
+          </w:tcPr>
+          <w:p>
+            <w:pPr>
+              <w:spacing w:before="0" w:after="0" w:line="252" w:lineRule="auto"/>
+              <w:jc w:val="left"/>
+            </w:pPr>
+            <w:r>
+              <w:rPr>
+                <w:rFonts w:ascii="Arial" w:hAnsi="Arial" w:eastAsia="Arial"/>
+                <w:b w:val="0"/>
+                <w:sz w:val="15"/>
+              </w:rPr>
+              <w:t>Деревья решений, критерии разбиения и контроль сложности</w:t>
+            </w:r>
+          </w:p>
+        </w:tc>
+        <w:tc>
+          <w:tcPr>
+            <w:tcW w:type="dxa" w:w="700"/>
+          </w:tcPr>
+          <w:p>
+            <w:pPr>
+              <w:spacing w:before="0" w:after="0" w:line="252" w:lineRule="auto"/>
+              <w:jc w:val="center"/>
+            </w:pPr>
+            <w:r>
+              <w:rPr>
+                <w:rFonts w:ascii="Arial" w:hAnsi="Arial" w:eastAsia="Arial"/>
+                <w:b w:val="0"/>
+                <w:sz w:val="15"/>
+              </w:rPr>
+              <w:t>4</w:t>
+            </w:r>
+          </w:p>
+        </w:tc>
+        <w:tc>
+          <w:tcPr>
+            <w:tcW w:type="dxa" w:w="430"/>
+          </w:tcPr>
+          <w:p>
+            <w:pPr>
+              <w:spacing w:before="0" w:after="0" w:line="252" w:lineRule="auto"/>
+              <w:jc w:val="center"/>
+            </w:pPr>
+            <w:r>
+              <w:rPr>
+                <w:rFonts w:ascii="Arial" w:hAnsi="Arial" w:eastAsia="Arial"/>
+                <w:b w:val="0"/>
+                <w:sz w:val="15"/>
               </w:rPr>
               <w:t>1</w:t>
             </w:r>
           </w:p>
         </w:tc>
+        <w:tc>
+          <w:tcPr>
+            <w:tcW w:type="dxa" w:w="480"/>
+          </w:tcPr>
+          <w:p>
+            <w:pPr>
+              <w:spacing w:before="0" w:after="0" w:line="252" w:lineRule="auto"/>
+              <w:jc w:val="center"/>
+            </w:pPr>
+            <w:r>
+              <w:rPr>
+                <w:rFonts w:ascii="Arial" w:hAnsi="Arial" w:eastAsia="Arial"/>
+                <w:b w:val="0"/>
+                <w:sz w:val="15"/>
+              </w:rPr>
+              <w:t>1</w:t>
+            </w:r>
+          </w:p>
+        </w:tc>
+        <w:tc>
+          <w:tcPr>
+            <w:tcW w:type="dxa" w:w="600"/>
+          </w:tcPr>
+          <w:p>
+            <w:pPr>
+              <w:spacing w:before="0" w:after="0" w:line="252" w:lineRule="auto"/>
+              <w:jc w:val="center"/>
+            </w:pPr>
+            <w:r>
+              <w:rPr>
+                <w:rFonts w:ascii="Arial" w:hAnsi="Arial" w:eastAsia="Arial"/>
+                <w:b w:val="0"/>
+                <w:sz w:val="15"/>
+              </w:rPr>
+              <w:t>2</w:t>
+            </w:r>
+          </w:p>
+        </w:tc>
+        <w:tc>
+          <w:tcPr>
+            <w:tcW w:type="dxa" w:w="2448"/>
+          </w:tcPr>
+          <w:p>
+            <w:pPr>
+              <w:spacing w:before="0" w:after="0" w:line="252" w:lineRule="auto"/>
+              <w:jc w:val="center"/>
+            </w:pPr>
+            <w:r>
+              <w:rPr>
+                <w:rFonts w:ascii="Arial" w:hAnsi="Arial" w:eastAsia="Arial"/>
+                <w:b w:val="0"/>
+                <w:sz w:val="15"/>
+              </w:rPr>
+              <w:t>ML-3.1</w:t>
+              <w:br/>
+              <w:t>ML-3.3</w:t>
+            </w:r>
+          </w:p>
+        </w:tc>
+        <w:tc>
+          <w:tcPr>
+            <w:tcW w:type="dxa" w:w="1150"/>
+          </w:tcPr>
+          <w:p>
+            <w:pPr>
+              <w:spacing w:before="0" w:after="0" w:line="252" w:lineRule="auto"/>
+              <w:jc w:val="center"/>
+            </w:pPr>
+            <w:r>
+              <w:rPr>
+                <w:rFonts w:ascii="Arial" w:hAnsi="Arial" w:eastAsia="Arial"/>
+                <w:b w:val="0"/>
+                <w:sz w:val="15"/>
+              </w:rPr>
+              <w:t>С</w:t>
+              <w:br/>
+              <w:t>С</w:t>
+            </w:r>
+          </w:p>
+        </w:tc>
+      </w:tr>
+      <w:tr>
+        <w:trPr>
+          <w:cantSplit/>
+        </w:trPr>
         <w:tc>
           <w:tcPr>
             <w:tcW w:type="dxa" w:w="500"/>
@@ -2445,15 +2923,34 @@
               <w:rPr>
                 <w:rFonts w:ascii="Arial" w:hAnsi="Arial" w:eastAsia="Arial"/>
                 <w:b w:val="0"/>
-                <w:sz w:val="16"/>
+                <w:sz w:val="15"/>
               </w:rPr>
-              <w:t>1</w:t>
+              <w:t>6</w:t>
             </w:r>
           </w:p>
         </w:tc>
         <w:tc>
           <w:tcPr>
-            <w:tcW w:type="dxa" w:w="650"/>
+            <w:tcW w:type="dxa" w:w="3330"/>
+          </w:tcPr>
+          <w:p>
+            <w:pPr>
+              <w:spacing w:before="0" w:after="0" w:line="252" w:lineRule="auto"/>
+              <w:jc w:val="left"/>
+            </w:pPr>
+            <w:r>
+              <w:rPr>
+                <w:rFonts w:ascii="Arial" w:hAnsi="Arial" w:eastAsia="Arial"/>
+                <w:b w:val="0"/>
+                <w:sz w:val="15"/>
+              </w:rPr>
+              <w:t>Bagging и Random Forest</w:t>
+            </w:r>
+          </w:p>
+        </w:tc>
+        <w:tc>
+          <w:tcPr>
+            <w:tcW w:type="dxa" w:w="700"/>
           </w:tcPr>
           <w:p>
             <w:pPr>
@@ -2464,7 +2961,7 @@
               <w:rPr>
                 <w:rFonts w:ascii="Arial" w:hAnsi="Arial" w:eastAsia="Arial"/>
                 <w:b w:val="0"/>
-                <w:sz w:val="16"/>
+                <w:sz w:val="15"/>
               </w:rPr>
               <w:t>4</w:t>
             </w:r>
@@ -2472,31 +2969,7 @@
         </w:tc>
         <w:tc>
           <w:tcPr>
-            <w:tcW w:type="dxa" w:w="2518"/>
-          </w:tcPr>
-          <w:p>
-            <w:pPr>
-              <w:spacing w:before="0" w:after="0" w:line="252" w:lineRule="auto"/>
-              <w:jc w:val="left"/>
-            </w:pPr>
-            <w:r>
-              <w:rPr>
-                <w:rFonts w:ascii="Arial" w:hAnsi="Arial" w:eastAsia="Arial"/>
-                <w:b w:val="0"/>
-                <w:sz w:val="16"/>
-              </w:rPr>
-              <w:t>ML-3.1, ML-3.3</w:t>
-            </w:r>
-          </w:p>
-        </w:tc>
-      </w:tr>
-      <w:tr>
-        <w:trPr>
-          <w:cantSplit/>
-        </w:trPr>
-        <w:tc>
-          <w:tcPr>
-            <w:tcW w:type="dxa" w:w="420"/>
+            <w:tcW w:type="dxa" w:w="430"/>
           </w:tcPr>
           <w:p>
             <w:pPr>
@@ -2507,34 +2980,15 @@
               <w:rPr>
                 <w:rFonts w:ascii="Arial" w:hAnsi="Arial" w:eastAsia="Arial"/>
                 <w:b w:val="0"/>
-                <w:sz w:val="16"/>
+                <w:sz w:val="15"/>
               </w:rPr>
-              <w:t>4</w:t>
+              <w:t>1</w:t>
             </w:r>
           </w:p>
         </w:tc>
         <w:tc>
           <w:tcPr>
-            <w:tcW w:type="dxa" w:w="4300"/>
-          </w:tcPr>
-          <w:p>
-            <w:pPr>
-              <w:spacing w:before="0" w:after="0" w:line="252" w:lineRule="auto"/>
-              <w:jc w:val="left"/>
-            </w:pPr>
-            <w:r>
-              <w:rPr>
-                <w:rFonts w:ascii="Arial" w:hAnsi="Arial" w:eastAsia="Arial"/>
-                <w:b w:val="0"/>
-                <w:sz w:val="16"/>
-              </w:rPr>
-              <w:t>SVM, разделяющая гиперплоскость и ядра</w:t>
-            </w:r>
-          </w:p>
-        </w:tc>
-        <w:tc>
-          <w:tcPr>
-            <w:tcW w:type="dxa" w:w="750"/>
+            <w:tcW w:type="dxa" w:w="480"/>
           </w:tcPr>
           <w:p>
             <w:pPr>
@@ -2545,12 +2999,78 @@
               <w:rPr>
                 <w:rFonts w:ascii="Arial" w:hAnsi="Arial" w:eastAsia="Arial"/>
                 <w:b w:val="0"/>
-                <w:sz w:val="16"/>
+                <w:sz w:val="15"/>
               </w:rPr>
-              <w:t>6</w:t>
+              <w:t>1</w:t>
             </w:r>
           </w:p>
         </w:tc>
+        <w:tc>
+          <w:tcPr>
+            <w:tcW w:type="dxa" w:w="600"/>
+          </w:tcPr>
+          <w:p>
+            <w:pPr>
+              <w:spacing w:before="0" w:after="0" w:line="252" w:lineRule="auto"/>
+              <w:jc w:val="center"/>
+            </w:pPr>
+            <w:r>
+              <w:rPr>
+                <w:rFonts w:ascii="Arial" w:hAnsi="Arial" w:eastAsia="Arial"/>
+                <w:b w:val="0"/>
+                <w:sz w:val="15"/>
+              </w:rPr>
+              <w:t>2</w:t>
+            </w:r>
+          </w:p>
+        </w:tc>
+        <w:tc>
+          <w:tcPr>
+            <w:tcW w:type="dxa" w:w="2448"/>
+          </w:tcPr>
+          <w:p>
+            <w:pPr>
+              <w:spacing w:before="0" w:after="0" w:line="252" w:lineRule="auto"/>
+              <w:jc w:val="center"/>
+            </w:pPr>
+            <w:r>
+              <w:rPr>
+                <w:rFonts w:ascii="Arial" w:hAnsi="Arial" w:eastAsia="Arial"/>
+                <w:b w:val="0"/>
+                <w:sz w:val="15"/>
+              </w:rPr>
+              <w:t>ML-3.2</w:t>
+              <w:br/>
+              <w:t>ML-3.3</w:t>
+            </w:r>
+          </w:p>
+        </w:tc>
+        <w:tc>
+          <w:tcPr>
+            <w:tcW w:type="dxa" w:w="1150"/>
+          </w:tcPr>
+          <w:p>
+            <w:pPr>
+              <w:spacing w:before="0" w:after="0" w:line="252" w:lineRule="auto"/>
+              <w:jc w:val="center"/>
+            </w:pPr>
+            <w:r>
+              <w:rPr>
+                <w:rFonts w:ascii="Arial" w:hAnsi="Arial" w:eastAsia="Arial"/>
+                <w:b w:val="0"/>
+                <w:sz w:val="15"/>
+              </w:rPr>
+              <w:t>С</w:t>
+              <w:br/>
+              <w:t>С</w:t>
+            </w:r>
+          </w:p>
+        </w:tc>
+      </w:tr>
+      <w:tr>
+        <w:trPr>
+          <w:cantSplit/>
+        </w:trPr>
         <w:tc>
           <w:tcPr>
             <w:tcW w:type="dxa" w:w="500"/>
@@ -2564,12 +3084,154 @@
               <w:rPr>
                 <w:rFonts w:ascii="Arial" w:hAnsi="Arial" w:eastAsia="Arial"/>
                 <w:b w:val="0"/>
-                <w:sz w:val="16"/>
+                <w:sz w:val="15"/>
+              </w:rPr>
+              <w:t>7</w:t>
+            </w:r>
+          </w:p>
+        </w:tc>
+        <w:tc>
+          <w:tcPr>
+            <w:tcW w:type="dxa" w:w="3330"/>
+          </w:tcPr>
+          <w:p>
+            <w:pPr>
+              <w:spacing w:before="0" w:after="0" w:line="252" w:lineRule="auto"/>
+              <w:jc w:val="left"/>
+            </w:pPr>
+            <w:r>
+              <w:rPr>
+                <w:rFonts w:ascii="Arial" w:hAnsi="Arial" w:eastAsia="Arial"/>
+                <w:b w:val="0"/>
+                <w:sz w:val="15"/>
+              </w:rPr>
+              <w:t>Boosting: AdaBoost, Gradient Boosting, XGBoost, LightGBM, CatBoost</w:t>
+            </w:r>
+          </w:p>
+        </w:tc>
+        <w:tc>
+          <w:tcPr>
+            <w:tcW w:type="dxa" w:w="700"/>
+          </w:tcPr>
+          <w:p>
+            <w:pPr>
+              <w:spacing w:before="0" w:after="0" w:line="252" w:lineRule="auto"/>
+              <w:jc w:val="center"/>
+            </w:pPr>
+            <w:r>
+              <w:rPr>
+                <w:rFonts w:ascii="Arial" w:hAnsi="Arial" w:eastAsia="Arial"/>
+                <w:b w:val="0"/>
+                <w:sz w:val="15"/>
+              </w:rPr>
+              <w:t>6</w:t>
+            </w:r>
+          </w:p>
+        </w:tc>
+        <w:tc>
+          <w:tcPr>
+            <w:tcW w:type="dxa" w:w="430"/>
+          </w:tcPr>
+          <w:p>
+            <w:pPr>
+              <w:spacing w:before="0" w:after="0" w:line="252" w:lineRule="auto"/>
+              <w:jc w:val="center"/>
+            </w:pPr>
+            <w:r>
+              <w:rPr>
+                <w:rFonts w:ascii="Arial" w:hAnsi="Arial" w:eastAsia="Arial"/>
+                <w:b w:val="0"/>
+                <w:sz w:val="15"/>
               </w:rPr>
               <w:t>1</w:t>
             </w:r>
           </w:p>
         </w:tc>
+        <w:tc>
+          <w:tcPr>
+            <w:tcW w:type="dxa" w:w="480"/>
+          </w:tcPr>
+          <w:p>
+            <w:pPr>
+              <w:spacing w:before="0" w:after="0" w:line="252" w:lineRule="auto"/>
+              <w:jc w:val="center"/>
+            </w:pPr>
+            <w:r>
+              <w:rPr>
+                <w:rFonts w:ascii="Arial" w:hAnsi="Arial" w:eastAsia="Arial"/>
+                <w:b w:val="0"/>
+                <w:sz w:val="15"/>
+              </w:rPr>
+              <w:t>1</w:t>
+            </w:r>
+          </w:p>
+        </w:tc>
+        <w:tc>
+          <w:tcPr>
+            <w:tcW w:type="dxa" w:w="600"/>
+          </w:tcPr>
+          <w:p>
+            <w:pPr>
+              <w:spacing w:before="0" w:after="0" w:line="252" w:lineRule="auto"/>
+              <w:jc w:val="center"/>
+            </w:pPr>
+            <w:r>
+              <w:rPr>
+                <w:rFonts w:ascii="Arial" w:hAnsi="Arial" w:eastAsia="Arial"/>
+                <w:b w:val="0"/>
+                <w:sz w:val="15"/>
+              </w:rPr>
+              <w:t>4</w:t>
+            </w:r>
+          </w:p>
+        </w:tc>
+        <w:tc>
+          <w:tcPr>
+            <w:tcW w:type="dxa" w:w="2448"/>
+          </w:tcPr>
+          <w:p>
+            <w:pPr>
+              <w:spacing w:before="0" w:after="0" w:line="252" w:lineRule="auto"/>
+              <w:jc w:val="center"/>
+            </w:pPr>
+            <w:r>
+              <w:rPr>
+                <w:rFonts w:ascii="Arial" w:hAnsi="Arial" w:eastAsia="Arial"/>
+                <w:b w:val="0"/>
+                <w:sz w:val="15"/>
+              </w:rPr>
+              <w:t>ML-3.2</w:t>
+              <w:br/>
+              <w:t>ML-3.3</w:t>
+            </w:r>
+          </w:p>
+        </w:tc>
+        <w:tc>
+          <w:tcPr>
+            <w:tcW w:type="dxa" w:w="1150"/>
+          </w:tcPr>
+          <w:p>
+            <w:pPr>
+              <w:spacing w:before="0" w:after="0" w:line="252" w:lineRule="auto"/>
+              <w:jc w:val="center"/>
+            </w:pPr>
+            <w:r>
+              <w:rPr>
+                <w:rFonts w:ascii="Arial" w:hAnsi="Arial" w:eastAsia="Arial"/>
+                <w:b w:val="0"/>
+                <w:sz w:val="15"/>
+              </w:rPr>
+              <w:t>С</w:t>
+              <w:br/>
+              <w:t>С</w:t>
+            </w:r>
+          </w:p>
+        </w:tc>
+      </w:tr>
+      <w:tr>
+        <w:trPr>
+          <w:cantSplit/>
+        </w:trPr>
         <w:tc>
           <w:tcPr>
             <w:tcW w:type="dxa" w:w="500"/>
@@ -2583,15 +3245,34 @@
               <w:rPr>
                 <w:rFonts w:ascii="Arial" w:hAnsi="Arial" w:eastAsia="Arial"/>
                 <w:b w:val="0"/>
-                <w:sz w:val="16"/>
+                <w:sz w:val="15"/>
               </w:rPr>
-              <w:t>1</w:t>
+              <w:t>8</w:t>
             </w:r>
           </w:p>
         </w:tc>
         <w:tc>
           <w:tcPr>
-            <w:tcW w:type="dxa" w:w="650"/>
+            <w:tcW w:type="dxa" w:w="3330"/>
+          </w:tcPr>
+          <w:p>
+            <w:pPr>
+              <w:spacing w:before="0" w:after="0" w:line="252" w:lineRule="auto"/>
+              <w:jc w:val="left"/>
+            </w:pPr>
+            <w:r>
+              <w:rPr>
+                <w:rFonts w:ascii="Arial" w:hAnsi="Arial" w:eastAsia="Arial"/>
+                <w:b w:val="0"/>
+                <w:sz w:val="15"/>
+              </w:rPr>
+              <w:t>Дисбаланс классов и feature engineering</w:t>
+            </w:r>
+          </w:p>
+        </w:tc>
+        <w:tc>
+          <w:tcPr>
+            <w:tcW w:type="dxa" w:w="700"/>
           </w:tcPr>
           <w:p>
             <w:pPr>
@@ -2602,39 +3283,15 @@
               <w:rPr>
                 <w:rFonts w:ascii="Arial" w:hAnsi="Arial" w:eastAsia="Arial"/>
                 <w:b w:val="0"/>
-                <w:sz w:val="16"/>
+                <w:sz w:val="15"/>
               </w:rPr>
-              <w:t>4</w:t>
+              <w:t>5</w:t>
             </w:r>
           </w:p>
         </w:tc>
         <w:tc>
           <w:tcPr>
-            <w:tcW w:type="dxa" w:w="2518"/>
-          </w:tcPr>
-          <w:p>
-            <w:pPr>
-              <w:spacing w:before="0" w:after="0" w:line="252" w:lineRule="auto"/>
-              <w:jc w:val="left"/>
-            </w:pPr>
-            <w:r>
-              <w:rPr>
-                <w:rFonts w:ascii="Arial" w:hAnsi="Arial" w:eastAsia="Arial"/>
-                <w:b w:val="0"/>
-                <w:sz w:val="16"/>
-              </w:rPr>
-              <w:t>ML-3.1, ML-3.3</w:t>
-            </w:r>
-          </w:p>
-        </w:tc>
-      </w:tr>
-      <w:tr>
-        <w:trPr>
-          <w:cantSplit/>
-        </w:trPr>
-        <w:tc>
-          <w:tcPr>
-            <w:tcW w:type="dxa" w:w="420"/>
+            <w:tcW w:type="dxa" w:w="430"/>
           </w:tcPr>
           <w:p>
             <w:pPr>
@@ -2645,34 +3302,15 @@
               <w:rPr>
                 <w:rFonts w:ascii="Arial" w:hAnsi="Arial" w:eastAsia="Arial"/>
                 <w:b w:val="0"/>
-                <w:sz w:val="16"/>
+                <w:sz w:val="15"/>
               </w:rPr>
-              <w:t>5</w:t>
+              <w:t>1</w:t>
             </w:r>
           </w:p>
         </w:tc>
         <w:tc>
           <w:tcPr>
-            <w:tcW w:type="dxa" w:w="4300"/>
-          </w:tcPr>
-          <w:p>
-            <w:pPr>
-              <w:spacing w:before="0" w:after="0" w:line="252" w:lineRule="auto"/>
-              <w:jc w:val="left"/>
-            </w:pPr>
-            <w:r>
-              <w:rPr>
-                <w:rFonts w:ascii="Arial" w:hAnsi="Arial" w:eastAsia="Arial"/>
-                <w:b w:val="0"/>
-                <w:sz w:val="16"/>
-              </w:rPr>
-              <w:t>Деревья решений, критерии разбиения и контроль сложности</w:t>
-            </w:r>
-          </w:p>
-        </w:tc>
-        <w:tc>
-          <w:tcPr>
-            <w:tcW w:type="dxa" w:w="750"/>
+            <w:tcW w:type="dxa" w:w="480"/>
           </w:tcPr>
           <w:p>
             <w:pPr>
@@ -2683,12 +3321,78 @@
               <w:rPr>
                 <w:rFonts w:ascii="Arial" w:hAnsi="Arial" w:eastAsia="Arial"/>
                 <w:b w:val="0"/>
-                <w:sz w:val="16"/>
+                <w:sz w:val="15"/>
               </w:rPr>
-              <w:t>4</w:t>
+              <w:t>1</w:t>
             </w:r>
           </w:p>
         </w:tc>
+        <w:tc>
+          <w:tcPr>
+            <w:tcW w:type="dxa" w:w="600"/>
+          </w:tcPr>
+          <w:p>
+            <w:pPr>
+              <w:spacing w:before="0" w:after="0" w:line="252" w:lineRule="auto"/>
+              <w:jc w:val="center"/>
+            </w:pPr>
+            <w:r>
+              <w:rPr>
+                <w:rFonts w:ascii="Arial" w:hAnsi="Arial" w:eastAsia="Arial"/>
+                <w:b w:val="0"/>
+                <w:sz w:val="15"/>
+              </w:rPr>
+              <w:t>3</w:t>
+            </w:r>
+          </w:p>
+        </w:tc>
+        <w:tc>
+          <w:tcPr>
+            <w:tcW w:type="dxa" w:w="2448"/>
+          </w:tcPr>
+          <w:p>
+            <w:pPr>
+              <w:spacing w:before="0" w:after="0" w:line="252" w:lineRule="auto"/>
+              <w:jc w:val="center"/>
+            </w:pPr>
+            <w:r>
+              <w:rPr>
+                <w:rFonts w:ascii="Arial" w:hAnsi="Arial" w:eastAsia="Arial"/>
+                <w:b w:val="0"/>
+                <w:sz w:val="15"/>
+              </w:rPr>
+              <w:t>ML-2.2</w:t>
+              <w:br/>
+              <w:t>ML-2.3</w:t>
+            </w:r>
+          </w:p>
+        </w:tc>
+        <w:tc>
+          <w:tcPr>
+            <w:tcW w:type="dxa" w:w="1150"/>
+          </w:tcPr>
+          <w:p>
+            <w:pPr>
+              <w:spacing w:before="0" w:after="0" w:line="252" w:lineRule="auto"/>
+              <w:jc w:val="center"/>
+            </w:pPr>
+            <w:r>
+              <w:rPr>
+                <w:rFonts w:ascii="Arial" w:hAnsi="Arial" w:eastAsia="Arial"/>
+                <w:b w:val="0"/>
+                <w:sz w:val="15"/>
+              </w:rPr>
+              <w:t>С</w:t>
+              <w:br/>
+              <w:t>С</w:t>
+            </w:r>
+          </w:p>
+        </w:tc>
+      </w:tr>
+      <w:tr>
+        <w:trPr>
+          <w:cantSplit/>
+        </w:trPr>
         <w:tc>
           <w:tcPr>
             <w:tcW w:type="dxa" w:w="500"/>
@@ -2702,12 +3406,154 @@
               <w:rPr>
                 <w:rFonts w:ascii="Arial" w:hAnsi="Arial" w:eastAsia="Arial"/>
                 <w:b w:val="0"/>
-                <w:sz w:val="16"/>
+                <w:sz w:val="15"/>
               </w:rPr>
-              <w:t>1</w:t>
+              <w:t>9</w:t>
             </w:r>
           </w:p>
         </w:tc>
+        <w:tc>
+          <w:tcPr>
+            <w:tcW w:type="dxa" w:w="3330"/>
+          </w:tcPr>
+          <w:p>
+            <w:pPr>
+              <w:spacing w:before="0" w:after="0" w:line="252" w:lineRule="auto"/>
+              <w:jc w:val="left"/>
+            </w:pPr>
+            <w:r>
+              <w:rPr>
+                <w:rFonts w:ascii="Arial" w:hAnsi="Arial" w:eastAsia="Arial"/>
+                <w:b w:val="0"/>
+                <w:sz w:val="15"/>
+              </w:rPr>
+              <w:t>MLP для классификации табличных данных</w:t>
+            </w:r>
+          </w:p>
+        </w:tc>
+        <w:tc>
+          <w:tcPr>
+            <w:tcW w:type="dxa" w:w="700"/>
+          </w:tcPr>
+          <w:p>
+            <w:pPr>
+              <w:spacing w:before="0" w:after="0" w:line="252" w:lineRule="auto"/>
+              <w:jc w:val="center"/>
+            </w:pPr>
+            <w:r>
+              <w:rPr>
+                <w:rFonts w:ascii="Arial" w:hAnsi="Arial" w:eastAsia="Arial"/>
+                <w:b w:val="0"/>
+                <w:sz w:val="15"/>
+              </w:rPr>
+              <w:t>10</w:t>
+            </w:r>
+          </w:p>
+        </w:tc>
+        <w:tc>
+          <w:tcPr>
+            <w:tcW w:type="dxa" w:w="430"/>
+          </w:tcPr>
+          <w:p>
+            <w:pPr>
+              <w:spacing w:before="0" w:after="0" w:line="252" w:lineRule="auto"/>
+              <w:jc w:val="center"/>
+            </w:pPr>
+            <w:r>
+              <w:rPr>
+                <w:rFonts w:ascii="Arial" w:hAnsi="Arial" w:eastAsia="Arial"/>
+                <w:b w:val="0"/>
+                <w:sz w:val="15"/>
+              </w:rPr>
+              <w:t>2</w:t>
+            </w:r>
+          </w:p>
+        </w:tc>
+        <w:tc>
+          <w:tcPr>
+            <w:tcW w:type="dxa" w:w="480"/>
+          </w:tcPr>
+          <w:p>
+            <w:pPr>
+              <w:spacing w:before="0" w:after="0" w:line="252" w:lineRule="auto"/>
+              <w:jc w:val="center"/>
+            </w:pPr>
+            <w:r>
+              <w:rPr>
+                <w:rFonts w:ascii="Arial" w:hAnsi="Arial" w:eastAsia="Arial"/>
+                <w:b w:val="0"/>
+                <w:sz w:val="15"/>
+              </w:rPr>
+              <w:t>2</w:t>
+            </w:r>
+          </w:p>
+        </w:tc>
+        <w:tc>
+          <w:tcPr>
+            <w:tcW w:type="dxa" w:w="600"/>
+          </w:tcPr>
+          <w:p>
+            <w:pPr>
+              <w:spacing w:before="0" w:after="0" w:line="252" w:lineRule="auto"/>
+              <w:jc w:val="center"/>
+            </w:pPr>
+            <w:r>
+              <w:rPr>
+                <w:rFonts w:ascii="Arial" w:hAnsi="Arial" w:eastAsia="Arial"/>
+                <w:b w:val="0"/>
+                <w:sz w:val="15"/>
+              </w:rPr>
+              <w:t>6</w:t>
+            </w:r>
+          </w:p>
+        </w:tc>
+        <w:tc>
+          <w:tcPr>
+            <w:tcW w:type="dxa" w:w="2448"/>
+          </w:tcPr>
+          <w:p>
+            <w:pPr>
+              <w:spacing w:before="0" w:after="0" w:line="252" w:lineRule="auto"/>
+              <w:jc w:val="center"/>
+            </w:pPr>
+            <w:r>
+              <w:rPr>
+                <w:rFonts w:ascii="Arial" w:hAnsi="Arial" w:eastAsia="Arial"/>
+                <w:b w:val="0"/>
+                <w:sz w:val="15"/>
+              </w:rPr>
+              <w:t>DL-1.1</w:t>
+              <w:br/>
+              <w:t>DL-1.2</w:t>
+            </w:r>
+          </w:p>
+        </w:tc>
+        <w:tc>
+          <w:tcPr>
+            <w:tcW w:type="dxa" w:w="1150"/>
+          </w:tcPr>
+          <w:p>
+            <w:pPr>
+              <w:spacing w:before="0" w:after="0" w:line="252" w:lineRule="auto"/>
+              <w:jc w:val="center"/>
+            </w:pPr>
+            <w:r>
+              <w:rPr>
+                <w:rFonts w:ascii="Arial" w:hAnsi="Arial" w:eastAsia="Arial"/>
+                <w:b w:val="0"/>
+                <w:sz w:val="15"/>
+              </w:rPr>
+              <w:t>С</w:t>
+              <w:br/>
+              <w:t>С</w:t>
+            </w:r>
+          </w:p>
+        </w:tc>
+      </w:tr>
+      <w:tr>
+        <w:trPr>
+          <w:cantSplit/>
+        </w:trPr>
         <w:tc>
           <w:tcPr>
             <w:tcW w:type="dxa" w:w="500"/>
@@ -2721,15 +3567,34 @@
               <w:rPr>
                 <w:rFonts w:ascii="Arial" w:hAnsi="Arial" w:eastAsia="Arial"/>
                 <w:b w:val="0"/>
-                <w:sz w:val="16"/>
+                <w:sz w:val="15"/>
               </w:rPr>
-              <w:t>1</w:t>
+              <w:t>10</w:t>
             </w:r>
           </w:p>
         </w:tc>
         <w:tc>
           <w:tcPr>
-            <w:tcW w:type="dxa" w:w="650"/>
+            <w:tcW w:type="dxa" w:w="3330"/>
+          </w:tcPr>
+          <w:p>
+            <w:pPr>
+              <w:spacing w:before="0" w:after="0" w:line="252" w:lineRule="auto"/>
+              <w:jc w:val="left"/>
+            </w:pPr>
+            <w:r>
+              <w:rPr>
+                <w:rFonts w:ascii="Arial" w:hAnsi="Arial" w:eastAsia="Arial"/>
+                <w:b w:val="0"/>
+                <w:sz w:val="15"/>
+              </w:rPr>
+              <w:t>CNN и transfer learning для классификации изображений</w:t>
+            </w:r>
+          </w:p>
+        </w:tc>
+        <w:tc>
+          <w:tcPr>
+            <w:tcW w:type="dxa" w:w="700"/>
           </w:tcPr>
           <w:p>
             <w:pPr>
@@ -2740,39 +3605,15 @@
               <w:rPr>
                 <w:rFonts w:ascii="Arial" w:hAnsi="Arial" w:eastAsia="Arial"/>
                 <w:b w:val="0"/>
-                <w:sz w:val="16"/>
+                <w:sz w:val="15"/>
               </w:rPr>
-              <w:t>2</w:t>
+              <w:t>10</w:t>
             </w:r>
           </w:p>
         </w:tc>
         <w:tc>
           <w:tcPr>
-            <w:tcW w:type="dxa" w:w="2518"/>
-          </w:tcPr>
-          <w:p>
-            <w:pPr>
-              <w:spacing w:before="0" w:after="0" w:line="252" w:lineRule="auto"/>
-              <w:jc w:val="left"/>
-            </w:pPr>
-            <w:r>
-              <w:rPr>
-                <w:rFonts w:ascii="Arial" w:hAnsi="Arial" w:eastAsia="Arial"/>
-                <w:b w:val="0"/>
-                <w:sz w:val="16"/>
-              </w:rPr>
-              <w:t>ML-3.1, ML-3.3</w:t>
-            </w:r>
-          </w:p>
-        </w:tc>
-      </w:tr>
-      <w:tr>
-        <w:trPr>
-          <w:cantSplit/>
-        </w:trPr>
-        <w:tc>
-          <w:tcPr>
-            <w:tcW w:type="dxa" w:w="420"/>
+            <w:tcW w:type="dxa" w:w="430"/>
           </w:tcPr>
           <w:p>
             <w:pPr>
@@ -2783,34 +3624,15 @@
               <w:rPr>
                 <w:rFonts w:ascii="Arial" w:hAnsi="Arial" w:eastAsia="Arial"/>
                 <w:b w:val="0"/>
-                <w:sz w:val="16"/>
+                <w:sz w:val="15"/>
               </w:rPr>
-              <w:t>6</w:t>
+              <w:t>2</w:t>
             </w:r>
           </w:p>
         </w:tc>
         <w:tc>
           <w:tcPr>
-            <w:tcW w:type="dxa" w:w="4300"/>
-          </w:tcPr>
-          <w:p>
-            <w:pPr>
-              <w:spacing w:before="0" w:after="0" w:line="252" w:lineRule="auto"/>
-              <w:jc w:val="left"/>
-            </w:pPr>
-            <w:r>
-              <w:rPr>
-                <w:rFonts w:ascii="Arial" w:hAnsi="Arial" w:eastAsia="Arial"/>
-                <w:b w:val="0"/>
-                <w:sz w:val="16"/>
-              </w:rPr>
-              <w:t>Bagging и Random Forest</w:t>
-            </w:r>
-          </w:p>
-        </w:tc>
-        <w:tc>
-          <w:tcPr>
-            <w:tcW w:type="dxa" w:w="750"/>
+            <w:tcW w:type="dxa" w:w="480"/>
           </w:tcPr>
           <w:p>
             <w:pPr>
@@ -2821,12 +3643,78 @@
               <w:rPr>
                 <w:rFonts w:ascii="Arial" w:hAnsi="Arial" w:eastAsia="Arial"/>
                 <w:b w:val="0"/>
-                <w:sz w:val="16"/>
+                <w:sz w:val="15"/>
               </w:rPr>
-              <w:t>4</w:t>
+              <w:t>2</w:t>
             </w:r>
           </w:p>
         </w:tc>
+        <w:tc>
+          <w:tcPr>
+            <w:tcW w:type="dxa" w:w="600"/>
+          </w:tcPr>
+          <w:p>
+            <w:pPr>
+              <w:spacing w:before="0" w:after="0" w:line="252" w:lineRule="auto"/>
+              <w:jc w:val="center"/>
+            </w:pPr>
+            <w:r>
+              <w:rPr>
+                <w:rFonts w:ascii="Arial" w:hAnsi="Arial" w:eastAsia="Arial"/>
+                <w:b w:val="0"/>
+                <w:sz w:val="15"/>
+              </w:rPr>
+              <w:t>6</w:t>
+            </w:r>
+          </w:p>
+        </w:tc>
+        <w:tc>
+          <w:tcPr>
+            <w:tcW w:type="dxa" w:w="2448"/>
+          </w:tcPr>
+          <w:p>
+            <w:pPr>
+              <w:spacing w:before="0" w:after="0" w:line="252" w:lineRule="auto"/>
+              <w:jc w:val="center"/>
+            </w:pPr>
+            <w:r>
+              <w:rPr>
+                <w:rFonts w:ascii="Arial" w:hAnsi="Arial" w:eastAsia="Arial"/>
+                <w:b w:val="0"/>
+                <w:sz w:val="15"/>
+              </w:rPr>
+              <w:t>DL-1.3</w:t>
+              <w:br/>
+              <w:t>DL-1.4</w:t>
+            </w:r>
+          </w:p>
+        </w:tc>
+        <w:tc>
+          <w:tcPr>
+            <w:tcW w:type="dxa" w:w="1150"/>
+          </w:tcPr>
+          <w:p>
+            <w:pPr>
+              <w:spacing w:before="0" w:after="0" w:line="252" w:lineRule="auto"/>
+              <w:jc w:val="center"/>
+            </w:pPr>
+            <w:r>
+              <w:rPr>
+                <w:rFonts w:ascii="Arial" w:hAnsi="Arial" w:eastAsia="Arial"/>
+                <w:b w:val="0"/>
+                <w:sz w:val="15"/>
+              </w:rPr>
+              <w:t>С</w:t>
+              <w:br/>
+              <w:t>С</w:t>
+            </w:r>
+          </w:p>
+        </w:tc>
+      </w:tr>
+      <w:tr>
+        <w:trPr>
+          <w:cantSplit/>
+        </w:trPr>
         <w:tc>
           <w:tcPr>
             <w:tcW w:type="dxa" w:w="500"/>
@@ -2840,15 +3728,34 @@
               <w:rPr>
                 <w:rFonts w:ascii="Arial" w:hAnsi="Arial" w:eastAsia="Arial"/>
                 <w:b w:val="0"/>
-                <w:sz w:val="16"/>
+                <w:sz w:val="15"/>
               </w:rPr>
-              <w:t>1</w:t>
+              <w:t>11</w:t>
             </w:r>
           </w:p>
         </w:tc>
         <w:tc>
           <w:tcPr>
-            <w:tcW w:type="dxa" w:w="500"/>
+            <w:tcW w:type="dxa" w:w="3330"/>
+          </w:tcPr>
+          <w:p>
+            <w:pPr>
+              <w:spacing w:before="0" w:after="0" w:line="252" w:lineRule="auto"/>
+              <w:jc w:val="left"/>
+            </w:pPr>
+            <w:r>
+              <w:rPr>
+                <w:rFonts w:ascii="Arial" w:hAnsi="Arial" w:eastAsia="Arial"/>
+                <w:b w:val="0"/>
+                <w:sz w:val="15"/>
+              </w:rPr>
+              <w:t>Прикладные кейсы, SHAP/LIME и анализ ошибок</w:t>
+            </w:r>
+          </w:p>
+        </w:tc>
+        <w:tc>
+          <w:tcPr>
+            <w:tcW w:type="dxa" w:w="700"/>
           </w:tcPr>
           <w:p>
             <w:pPr>
@@ -2859,15 +3766,15 @@
               <w:rPr>
                 <w:rFonts w:ascii="Arial" w:hAnsi="Arial" w:eastAsia="Arial"/>
                 <w:b w:val="0"/>
-                <w:sz w:val="16"/>
+                <w:sz w:val="15"/>
               </w:rPr>
-              <w:t>1</w:t>
+              <w:t>6,8</w:t>
             </w:r>
           </w:p>
         </w:tc>
         <w:tc>
           <w:tcPr>
-            <w:tcW w:type="dxa" w:w="650"/>
+            <w:tcW w:type="dxa" w:w="430"/>
           </w:tcPr>
           <w:p>
             <w:pPr>
@@ -2878,7 +3785,7 @@
               <w:rPr>
                 <w:rFonts w:ascii="Arial" w:hAnsi="Arial" w:eastAsia="Arial"/>
                 <w:b w:val="0"/>
-                <w:sz w:val="16"/>
+                <w:sz w:val="15"/>
               </w:rPr>
               <w:t>2</w:t>
             </w:r>
@@ -2886,31 +3793,7 @@
         </w:tc>
         <w:tc>
           <w:tcPr>
-            <w:tcW w:type="dxa" w:w="2518"/>
-          </w:tcPr>
-          <w:p>
-            <w:pPr>
-              <w:spacing w:before="0" w:after="0" w:line="252" w:lineRule="auto"/>
-              <w:jc w:val="left"/>
-            </w:pPr>
-            <w:r>
-              <w:rPr>
-                <w:rFonts w:ascii="Arial" w:hAnsi="Arial" w:eastAsia="Arial"/>
-                <w:b w:val="0"/>
-                <w:sz w:val="16"/>
-              </w:rPr>
-              <w:t>ML-3.2, ML-3.3</w:t>
-            </w:r>
-          </w:p>
-        </w:tc>
-      </w:tr>
-      <w:tr>
-        <w:trPr>
-          <w:cantSplit/>
-        </w:trPr>
-        <w:tc>
-          <w:tcPr>
-            <w:tcW w:type="dxa" w:w="420"/>
+            <w:tcW w:type="dxa" w:w="480"/>
           </w:tcPr>
           <w:p>
             <w:pPr>
@@ -2921,34 +3804,15 @@
               <w:rPr>
                 <w:rFonts w:ascii="Arial" w:hAnsi="Arial" w:eastAsia="Arial"/>
                 <w:b w:val="0"/>
-                <w:sz w:val="16"/>
+                <w:sz w:val="15"/>
               </w:rPr>
-              <w:t>7</w:t>
+              <w:t>2</w:t>
             </w:r>
           </w:p>
         </w:tc>
         <w:tc>
           <w:tcPr>
-            <w:tcW w:type="dxa" w:w="4300"/>
-          </w:tcPr>
-          <w:p>
-            <w:pPr>
-              <w:spacing w:before="0" w:after="0" w:line="252" w:lineRule="auto"/>
-              <w:jc w:val="left"/>
-            </w:pPr>
-            <w:r>
-              <w:rPr>
-                <w:rFonts w:ascii="Arial" w:hAnsi="Arial" w:eastAsia="Arial"/>
-                <w:b w:val="0"/>
-                <w:sz w:val="16"/>
-              </w:rPr>
-              <w:t>Boosting: AdaBoost, Gradient Boosting, XGBoost, LightGBM, CatBoost</w:t>
-            </w:r>
-          </w:p>
-        </w:tc>
-        <w:tc>
-          <w:tcPr>
-            <w:tcW w:type="dxa" w:w="750"/>
+            <w:tcW w:type="dxa" w:w="600"/>
           </w:tcPr>
           <w:p>
             <w:pPr>
@@ -2959,15 +3823,15 @@
               <w:rPr>
                 <w:rFonts w:ascii="Arial" w:hAnsi="Arial" w:eastAsia="Arial"/>
                 <w:b w:val="0"/>
-                <w:sz w:val="16"/>
+                <w:sz w:val="15"/>
               </w:rPr>
-              <w:t>6</w:t>
+              <w:t>2,8</w:t>
             </w:r>
           </w:p>
         </w:tc>
         <w:tc>
           <w:tcPr>
-            <w:tcW w:type="dxa" w:w="500"/>
+            <w:tcW w:type="dxa" w:w="2448"/>
           </w:tcPr>
           <w:p>
             <w:pPr>
@@ -2978,15 +3842,19 @@
               <w:rPr>
                 <w:rFonts w:ascii="Arial" w:hAnsi="Arial" w:eastAsia="Arial"/>
                 <w:b w:val="0"/>
-                <w:sz w:val="16"/>
+                <w:sz w:val="15"/>
               </w:rPr>
-              <w:t>1</w:t>
+              <w:t>ML-2.3</w:t>
+              <w:br/>
+              <w:t>ML-3.3</w:t>
+              <w:br/>
+              <w:t>DL-1.3</w:t>
             </w:r>
           </w:p>
         </w:tc>
         <w:tc>
           <w:tcPr>
-            <w:tcW w:type="dxa" w:w="500"/>
+            <w:tcW w:type="dxa" w:w="1150"/>
           </w:tcPr>
           <w:p>
             <w:pPr>
@@ -2997,47 +3865,13 @@
               <w:rPr>
                 <w:rFonts w:ascii="Arial" w:hAnsi="Arial" w:eastAsia="Arial"/>
                 <w:b w:val="0"/>
-                <w:sz w:val="16"/>
+                <w:sz w:val="15"/>
               </w:rPr>
-              <w:t>1</w:t>
-            </w:r>
-          </w:p>
-        </w:tc>
-        <w:tc>
-          <w:tcPr>
-            <w:tcW w:type="dxa" w:w="650"/>
-          </w:tcPr>
-          <w:p>
-            <w:pPr>
-              <w:spacing w:before="0" w:after="0" w:line="252" w:lineRule="auto"/>
-              <w:jc w:val="center"/>
-            </w:pPr>
-            <w:r>
-              <w:rPr>
-                <w:rFonts w:ascii="Arial" w:hAnsi="Arial" w:eastAsia="Arial"/>
-                <w:b w:val="0"/>
-                <w:sz w:val="16"/>
-              </w:rPr>
-              <w:t>4</w:t>
-            </w:r>
-          </w:p>
-        </w:tc>
-        <w:tc>
-          <w:tcPr>
-            <w:tcW w:type="dxa" w:w="2518"/>
-          </w:tcPr>
-          <w:p>
-            <w:pPr>
-              <w:spacing w:before="0" w:after="0" w:line="252" w:lineRule="auto"/>
-              <w:jc w:val="left"/>
-            </w:pPr>
-            <w:r>
-              <w:rPr>
-                <w:rFonts w:ascii="Arial" w:hAnsi="Arial" w:eastAsia="Arial"/>
-                <w:b w:val="0"/>
-                <w:sz w:val="16"/>
-              </w:rPr>
-              <w:t>ML-3.2, ML-3.3</w:t>
+              <w:t>С</w:t>
+              <w:br/>
+              <w:t>С</w:t>
+              <w:br/>
+              <w:t>С</w:t>
             </w:r>
           </w:p>
         </w:tc>
@@ -3046,617 +3880,6 @@
         <w:trPr>
           <w:cantSplit/>
         </w:trPr>
-        <w:tc>
-          <w:tcPr>
-            <w:tcW w:type="dxa" w:w="420"/>
-          </w:tcPr>
-          <w:p>
-            <w:pPr>
-              <w:spacing w:before="0" w:after="0" w:line="252" w:lineRule="auto"/>
-              <w:jc w:val="center"/>
-            </w:pPr>
-            <w:r>
-              <w:rPr>
-                <w:rFonts w:ascii="Arial" w:hAnsi="Arial" w:eastAsia="Arial"/>
-                <w:b w:val="0"/>
-                <w:sz w:val="16"/>
-              </w:rPr>
-              <w:t>8</w:t>
-            </w:r>
-          </w:p>
-        </w:tc>
-        <w:tc>
-          <w:tcPr>
-            <w:tcW w:type="dxa" w:w="4300"/>
-          </w:tcPr>
-          <w:p>
-            <w:pPr>
-              <w:spacing w:before="0" w:after="0" w:line="252" w:lineRule="auto"/>
-              <w:jc w:val="left"/>
-            </w:pPr>
-            <w:r>
-              <w:rPr>
-                <w:rFonts w:ascii="Arial" w:hAnsi="Arial" w:eastAsia="Arial"/>
-                <w:b w:val="0"/>
-                <w:sz w:val="16"/>
-              </w:rPr>
-              <w:t>Дисбаланс классов и feature engineering</w:t>
-            </w:r>
-          </w:p>
-        </w:tc>
-        <w:tc>
-          <w:tcPr>
-            <w:tcW w:type="dxa" w:w="750"/>
-          </w:tcPr>
-          <w:p>
-            <w:pPr>
-              <w:spacing w:before="0" w:after="0" w:line="252" w:lineRule="auto"/>
-              <w:jc w:val="center"/>
-            </w:pPr>
-            <w:r>
-              <w:rPr>
-                <w:rFonts w:ascii="Arial" w:hAnsi="Arial" w:eastAsia="Arial"/>
-                <w:b w:val="0"/>
-                <w:sz w:val="16"/>
-              </w:rPr>
-              <w:t>5</w:t>
-            </w:r>
-          </w:p>
-        </w:tc>
-        <w:tc>
-          <w:tcPr>
-            <w:tcW w:type="dxa" w:w="500"/>
-          </w:tcPr>
-          <w:p>
-            <w:pPr>
-              <w:spacing w:before="0" w:after="0" w:line="252" w:lineRule="auto"/>
-              <w:jc w:val="center"/>
-            </w:pPr>
-            <w:r>
-              <w:rPr>
-                <w:rFonts w:ascii="Arial" w:hAnsi="Arial" w:eastAsia="Arial"/>
-                <w:b w:val="0"/>
-                <w:sz w:val="16"/>
-              </w:rPr>
-              <w:t>1</w:t>
-            </w:r>
-          </w:p>
-        </w:tc>
-        <w:tc>
-          <w:tcPr>
-            <w:tcW w:type="dxa" w:w="500"/>
-          </w:tcPr>
-          <w:p>
-            <w:pPr>
-              <w:spacing w:before="0" w:after="0" w:line="252" w:lineRule="auto"/>
-              <w:jc w:val="center"/>
-            </w:pPr>
-            <w:r>
-              <w:rPr>
-                <w:rFonts w:ascii="Arial" w:hAnsi="Arial" w:eastAsia="Arial"/>
-                <w:b w:val="0"/>
-                <w:sz w:val="16"/>
-              </w:rPr>
-              <w:t>1</w:t>
-            </w:r>
-          </w:p>
-        </w:tc>
-        <w:tc>
-          <w:tcPr>
-            <w:tcW w:type="dxa" w:w="650"/>
-          </w:tcPr>
-          <w:p>
-            <w:pPr>
-              <w:spacing w:before="0" w:after="0" w:line="252" w:lineRule="auto"/>
-              <w:jc w:val="center"/>
-            </w:pPr>
-            <w:r>
-              <w:rPr>
-                <w:rFonts w:ascii="Arial" w:hAnsi="Arial" w:eastAsia="Arial"/>
-                <w:b w:val="0"/>
-                <w:sz w:val="16"/>
-              </w:rPr>
-              <w:t>3</w:t>
-            </w:r>
-          </w:p>
-        </w:tc>
-        <w:tc>
-          <w:tcPr>
-            <w:tcW w:type="dxa" w:w="2518"/>
-          </w:tcPr>
-          <w:p>
-            <w:pPr>
-              <w:spacing w:before="0" w:after="0" w:line="252" w:lineRule="auto"/>
-              <w:jc w:val="left"/>
-            </w:pPr>
-            <w:r>
-              <w:rPr>
-                <w:rFonts w:ascii="Arial" w:hAnsi="Arial" w:eastAsia="Arial"/>
-                <w:b w:val="0"/>
-                <w:sz w:val="16"/>
-              </w:rPr>
-              <w:t>ML-2.2, ML-2.3</w:t>
-            </w:r>
-          </w:p>
-        </w:tc>
-      </w:tr>
-      <w:tr>
-        <w:trPr>
-          <w:cantSplit/>
-        </w:trPr>
-        <w:tc>
-          <w:tcPr>
-            <w:tcW w:type="dxa" w:w="420"/>
-          </w:tcPr>
-          <w:p>
-            <w:pPr>
-              <w:spacing w:before="0" w:after="0" w:line="252" w:lineRule="auto"/>
-              <w:jc w:val="center"/>
-            </w:pPr>
-            <w:r>
-              <w:rPr>
-                <w:rFonts w:ascii="Arial" w:hAnsi="Arial" w:eastAsia="Arial"/>
-                <w:b w:val="0"/>
-                <w:sz w:val="16"/>
-              </w:rPr>
-              <w:t>9</w:t>
-            </w:r>
-          </w:p>
-        </w:tc>
-        <w:tc>
-          <w:tcPr>
-            <w:tcW w:type="dxa" w:w="4300"/>
-          </w:tcPr>
-          <w:p>
-            <w:pPr>
-              <w:spacing w:before="0" w:after="0" w:line="252" w:lineRule="auto"/>
-              <w:jc w:val="left"/>
-            </w:pPr>
-            <w:r>
-              <w:rPr>
-                <w:rFonts w:ascii="Arial" w:hAnsi="Arial" w:eastAsia="Arial"/>
-                <w:b w:val="0"/>
-                <w:sz w:val="16"/>
-              </w:rPr>
-              <w:t>MLP для классификации табличных данных</w:t>
-            </w:r>
-          </w:p>
-        </w:tc>
-        <w:tc>
-          <w:tcPr>
-            <w:tcW w:type="dxa" w:w="750"/>
-          </w:tcPr>
-          <w:p>
-            <w:pPr>
-              <w:spacing w:before="0" w:after="0" w:line="252" w:lineRule="auto"/>
-              <w:jc w:val="center"/>
-            </w:pPr>
-            <w:r>
-              <w:rPr>
-                <w:rFonts w:ascii="Arial" w:hAnsi="Arial" w:eastAsia="Arial"/>
-                <w:b w:val="0"/>
-                <w:sz w:val="16"/>
-              </w:rPr>
-              <w:t>10</w:t>
-            </w:r>
-          </w:p>
-        </w:tc>
-        <w:tc>
-          <w:tcPr>
-            <w:tcW w:type="dxa" w:w="500"/>
-          </w:tcPr>
-          <w:p>
-            <w:pPr>
-              <w:spacing w:before="0" w:after="0" w:line="252" w:lineRule="auto"/>
-              <w:jc w:val="center"/>
-            </w:pPr>
-            <w:r>
-              <w:rPr>
-                <w:rFonts w:ascii="Arial" w:hAnsi="Arial" w:eastAsia="Arial"/>
-                <w:b w:val="0"/>
-                <w:sz w:val="16"/>
-              </w:rPr>
-              <w:t>2</w:t>
-            </w:r>
-          </w:p>
-        </w:tc>
-        <w:tc>
-          <w:tcPr>
-            <w:tcW w:type="dxa" w:w="500"/>
-          </w:tcPr>
-          <w:p>
-            <w:pPr>
-              <w:spacing w:before="0" w:after="0" w:line="252" w:lineRule="auto"/>
-              <w:jc w:val="center"/>
-            </w:pPr>
-            <w:r>
-              <w:rPr>
-                <w:rFonts w:ascii="Arial" w:hAnsi="Arial" w:eastAsia="Arial"/>
-                <w:b w:val="0"/>
-                <w:sz w:val="16"/>
-              </w:rPr>
-              <w:t>2</w:t>
-            </w:r>
-          </w:p>
-        </w:tc>
-        <w:tc>
-          <w:tcPr>
-            <w:tcW w:type="dxa" w:w="650"/>
-          </w:tcPr>
-          <w:p>
-            <w:pPr>
-              <w:spacing w:before="0" w:after="0" w:line="252" w:lineRule="auto"/>
-              <w:jc w:val="center"/>
-            </w:pPr>
-            <w:r>
-              <w:rPr>
-                <w:rFonts w:ascii="Arial" w:hAnsi="Arial" w:eastAsia="Arial"/>
-                <w:b w:val="0"/>
-                <w:sz w:val="16"/>
-              </w:rPr>
-              <w:t>6</w:t>
-            </w:r>
-          </w:p>
-        </w:tc>
-        <w:tc>
-          <w:tcPr>
-            <w:tcW w:type="dxa" w:w="2518"/>
-          </w:tcPr>
-          <w:p>
-            <w:pPr>
-              <w:spacing w:before="0" w:after="0" w:line="252" w:lineRule="auto"/>
-              <w:jc w:val="left"/>
-            </w:pPr>
-            <w:r>
-              <w:rPr>
-                <w:rFonts w:ascii="Arial" w:hAnsi="Arial" w:eastAsia="Arial"/>
-                <w:b w:val="0"/>
-                <w:sz w:val="16"/>
-              </w:rPr>
-              <w:t>DL-1.1, DL-1.2</w:t>
-            </w:r>
-          </w:p>
-        </w:tc>
-      </w:tr>
-      <w:tr>
-        <w:trPr>
-          <w:cantSplit/>
-        </w:trPr>
-        <w:tc>
-          <w:tcPr>
-            <w:tcW w:type="dxa" w:w="420"/>
-          </w:tcPr>
-          <w:p>
-            <w:pPr>
-              <w:spacing w:before="0" w:after="0" w:line="252" w:lineRule="auto"/>
-              <w:jc w:val="center"/>
-            </w:pPr>
-            <w:r>
-              <w:rPr>
-                <w:rFonts w:ascii="Arial" w:hAnsi="Arial" w:eastAsia="Arial"/>
-                <w:b w:val="0"/>
-                <w:sz w:val="16"/>
-              </w:rPr>
-              <w:t>10</w:t>
-            </w:r>
-          </w:p>
-        </w:tc>
-        <w:tc>
-          <w:tcPr>
-            <w:tcW w:type="dxa" w:w="4300"/>
-          </w:tcPr>
-          <w:p>
-            <w:pPr>
-              <w:spacing w:before="0" w:after="0" w:line="252" w:lineRule="auto"/>
-              <w:jc w:val="left"/>
-            </w:pPr>
-            <w:r>
-              <w:rPr>
-                <w:rFonts w:ascii="Arial" w:hAnsi="Arial" w:eastAsia="Arial"/>
-                <w:b w:val="0"/>
-                <w:sz w:val="16"/>
-              </w:rPr>
-              <w:t>CNN и transfer learning для классификации изображений</w:t>
-            </w:r>
-          </w:p>
-        </w:tc>
-        <w:tc>
-          <w:tcPr>
-            <w:tcW w:type="dxa" w:w="750"/>
-          </w:tcPr>
-          <w:p>
-            <w:pPr>
-              <w:spacing w:before="0" w:after="0" w:line="252" w:lineRule="auto"/>
-              <w:jc w:val="center"/>
-            </w:pPr>
-            <w:r>
-              <w:rPr>
-                <w:rFonts w:ascii="Arial" w:hAnsi="Arial" w:eastAsia="Arial"/>
-                <w:b w:val="0"/>
-                <w:sz w:val="16"/>
-              </w:rPr>
-              <w:t>10</w:t>
-            </w:r>
-          </w:p>
-        </w:tc>
-        <w:tc>
-          <w:tcPr>
-            <w:tcW w:type="dxa" w:w="500"/>
-          </w:tcPr>
-          <w:p>
-            <w:pPr>
-              <w:spacing w:before="0" w:after="0" w:line="252" w:lineRule="auto"/>
-              <w:jc w:val="center"/>
-            </w:pPr>
-            <w:r>
-              <w:rPr>
-                <w:rFonts w:ascii="Arial" w:hAnsi="Arial" w:eastAsia="Arial"/>
-                <w:b w:val="0"/>
-                <w:sz w:val="16"/>
-              </w:rPr>
-              <w:t>2</w:t>
-            </w:r>
-          </w:p>
-        </w:tc>
-        <w:tc>
-          <w:tcPr>
-            <w:tcW w:type="dxa" w:w="500"/>
-          </w:tcPr>
-          <w:p>
-            <w:pPr>
-              <w:spacing w:before="0" w:after="0" w:line="252" w:lineRule="auto"/>
-              <w:jc w:val="center"/>
-            </w:pPr>
-            <w:r>
-              <w:rPr>
-                <w:rFonts w:ascii="Arial" w:hAnsi="Arial" w:eastAsia="Arial"/>
-                <w:b w:val="0"/>
-                <w:sz w:val="16"/>
-              </w:rPr>
-              <w:t>2</w:t>
-            </w:r>
-          </w:p>
-        </w:tc>
-        <w:tc>
-          <w:tcPr>
-            <w:tcW w:type="dxa" w:w="650"/>
-          </w:tcPr>
-          <w:p>
-            <w:pPr>
-              <w:spacing w:before="0" w:after="0" w:line="252" w:lineRule="auto"/>
-              <w:jc w:val="center"/>
-            </w:pPr>
-            <w:r>
-              <w:rPr>
-                <w:rFonts w:ascii="Arial" w:hAnsi="Arial" w:eastAsia="Arial"/>
-                <w:b w:val="0"/>
-                <w:sz w:val="16"/>
-              </w:rPr>
-              <w:t>6</w:t>
-            </w:r>
-          </w:p>
-        </w:tc>
-        <w:tc>
-          <w:tcPr>
-            <w:tcW w:type="dxa" w:w="2518"/>
-          </w:tcPr>
-          <w:p>
-            <w:pPr>
-              <w:spacing w:before="0" w:after="0" w:line="252" w:lineRule="auto"/>
-              <w:jc w:val="left"/>
-            </w:pPr>
-            <w:r>
-              <w:rPr>
-                <w:rFonts w:ascii="Arial" w:hAnsi="Arial" w:eastAsia="Arial"/>
-                <w:b w:val="0"/>
-                <w:sz w:val="16"/>
-              </w:rPr>
-              <w:t>DL-1.3, DL-1.4</w:t>
-            </w:r>
-          </w:p>
-        </w:tc>
-      </w:tr>
-      <w:tr>
-        <w:trPr>
-          <w:cantSplit/>
-        </w:trPr>
-        <w:tc>
-          <w:tcPr>
-            <w:tcW w:type="dxa" w:w="420"/>
-          </w:tcPr>
-          <w:p>
-            <w:pPr>
-              <w:spacing w:before="0" w:after="0" w:line="252" w:lineRule="auto"/>
-              <w:jc w:val="center"/>
-            </w:pPr>
-            <w:r>
-              <w:rPr>
-                <w:rFonts w:ascii="Arial" w:hAnsi="Arial" w:eastAsia="Arial"/>
-                <w:b w:val="0"/>
-                <w:sz w:val="16"/>
-              </w:rPr>
-              <w:t>11</w:t>
-            </w:r>
-          </w:p>
-        </w:tc>
-        <w:tc>
-          <w:tcPr>
-            <w:tcW w:type="dxa" w:w="4300"/>
-          </w:tcPr>
-          <w:p>
-            <w:pPr>
-              <w:spacing w:before="0" w:after="0" w:line="252" w:lineRule="auto"/>
-              <w:jc w:val="left"/>
-            </w:pPr>
-            <w:r>
-              <w:rPr>
-                <w:rFonts w:ascii="Arial" w:hAnsi="Arial" w:eastAsia="Arial"/>
-                <w:b w:val="0"/>
-                <w:sz w:val="16"/>
-              </w:rPr>
-              <w:t>Прикладные кейсы, SHAP/LIME и анализ ошибок</w:t>
-            </w:r>
-          </w:p>
-        </w:tc>
-        <w:tc>
-          <w:tcPr>
-            <w:tcW w:type="dxa" w:w="750"/>
-          </w:tcPr>
-          <w:p>
-            <w:pPr>
-              <w:spacing w:before="0" w:after="0" w:line="252" w:lineRule="auto"/>
-              <w:jc w:val="center"/>
-            </w:pPr>
-            <w:r>
-              <w:rPr>
-                <w:rFonts w:ascii="Arial" w:hAnsi="Arial" w:eastAsia="Arial"/>
-                <w:b w:val="0"/>
-                <w:sz w:val="16"/>
-              </w:rPr>
-              <w:t>6,8</w:t>
-            </w:r>
-          </w:p>
-        </w:tc>
-        <w:tc>
-          <w:tcPr>
-            <w:tcW w:type="dxa" w:w="500"/>
-          </w:tcPr>
-          <w:p>
-            <w:pPr>
-              <w:spacing w:before="0" w:after="0" w:line="252" w:lineRule="auto"/>
-              <w:jc w:val="center"/>
-            </w:pPr>
-            <w:r>
-              <w:rPr>
-                <w:rFonts w:ascii="Arial" w:hAnsi="Arial" w:eastAsia="Arial"/>
-                <w:b w:val="0"/>
-                <w:sz w:val="16"/>
-              </w:rPr>
-              <w:t>2</w:t>
-            </w:r>
-          </w:p>
-        </w:tc>
-        <w:tc>
-          <w:tcPr>
-            <w:tcW w:type="dxa" w:w="500"/>
-          </w:tcPr>
-          <w:p>
-            <w:pPr>
-              <w:spacing w:before="0" w:after="0" w:line="252" w:lineRule="auto"/>
-              <w:jc w:val="center"/>
-            </w:pPr>
-            <w:r>
-              <w:rPr>
-                <w:rFonts w:ascii="Arial" w:hAnsi="Arial" w:eastAsia="Arial"/>
-                <w:b w:val="0"/>
-                <w:sz w:val="16"/>
-              </w:rPr>
-              <w:t>2</w:t>
-            </w:r>
-          </w:p>
-        </w:tc>
-        <w:tc>
-          <w:tcPr>
-            <w:tcW w:type="dxa" w:w="650"/>
-          </w:tcPr>
-          <w:p>
-            <w:pPr>
-              <w:spacing w:before="0" w:after="0" w:line="252" w:lineRule="auto"/>
-              <w:jc w:val="center"/>
-            </w:pPr>
-            <w:r>
-              <w:rPr>
-                <w:rFonts w:ascii="Arial" w:hAnsi="Arial" w:eastAsia="Arial"/>
-                <w:b w:val="0"/>
-                <w:sz w:val="16"/>
-              </w:rPr>
-              <w:t>2,8</w:t>
-            </w:r>
-          </w:p>
-        </w:tc>
-        <w:tc>
-          <w:tcPr>
-            <w:tcW w:type="dxa" w:w="2518"/>
-          </w:tcPr>
-          <w:p>
-            <w:pPr>
-              <w:spacing w:before="0" w:after="0" w:line="252" w:lineRule="auto"/>
-              <w:jc w:val="left"/>
-            </w:pPr>
-            <w:r>
-              <w:rPr>
-                <w:rFonts w:ascii="Arial" w:hAnsi="Arial" w:eastAsia="Arial"/>
-                <w:b w:val="0"/>
-                <w:sz w:val="16"/>
-              </w:rPr>
-              <w:t>ML-2.3, ML-3.3, DL-1.3</w:t>
-            </w:r>
-          </w:p>
-        </w:tc>
-      </w:tr>
-      <w:tr>
-        <w:trPr>
-          <w:cantSplit/>
-        </w:trPr>
-        <w:tc>
-          <w:tcPr>
-            <w:tcW w:type="dxa" w:w="420"/>
-            <w:shd w:fill="F4F7F9"/>
-          </w:tcPr>
-          <w:p>
-            <w:pPr>
-              <w:spacing w:before="0" w:after="0" w:line="252" w:lineRule="auto"/>
-              <w:jc w:val="center"/>
-            </w:pPr>
-            <w:r>
-              <w:rPr>
-                <w:rFonts w:ascii="Arial" w:hAnsi="Arial" w:eastAsia="Arial"/>
-                <w:b/>
-                <w:sz w:val="16"/>
-              </w:rPr>
-            </w:r>
-          </w:p>
-        </w:tc>
-        <w:tc>
-          <w:tcPr>
-            <w:tcW w:type="dxa" w:w="4300"/>
-            <w:shd w:fill="F4F7F9"/>
-          </w:tcPr>
-          <w:p>
-            <w:pPr>
-              <w:spacing w:before="0" w:after="0" w:line="252" w:lineRule="auto"/>
-              <w:jc w:val="left"/>
-            </w:pPr>
-            <w:r>
-              <w:rPr>
-                <w:rFonts w:ascii="Arial" w:hAnsi="Arial" w:eastAsia="Arial"/>
-                <w:b/>
-                <w:sz w:val="16"/>
-              </w:rPr>
-              <w:t>По разделам</w:t>
-            </w:r>
-          </w:p>
-        </w:tc>
-        <w:tc>
-          <w:tcPr>
-            <w:tcW w:type="dxa" w:w="750"/>
-            <w:shd w:fill="F4F7F9"/>
-          </w:tcPr>
-          <w:p>
-            <w:pPr>
-              <w:spacing w:before="0" w:after="0" w:line="252" w:lineRule="auto"/>
-              <w:jc w:val="center"/>
-            </w:pPr>
-            <w:r>
-              <w:rPr>
-                <w:rFonts w:ascii="Arial" w:hAnsi="Arial" w:eastAsia="Arial"/>
-                <w:b/>
-                <w:sz w:val="16"/>
-              </w:rPr>
-              <w:t>69,8</w:t>
-            </w:r>
-          </w:p>
-        </w:tc>
         <w:tc>
           <w:tcPr>
             <w:tcW w:type="dxa" w:w="500"/>
@@ -3671,12 +3894,154 @@
               <w:rPr>
                 <w:rFonts w:ascii="Arial" w:hAnsi="Arial" w:eastAsia="Arial"/>
                 <w:b/>
-                <w:sz w:val="16"/>
+                <w:sz w:val="15"/>
+              </w:rPr>
+            </w:r>
+          </w:p>
+        </w:tc>
+        <w:tc>
+          <w:tcPr>
+            <w:tcW w:type="dxa" w:w="3330"/>
+            <w:shd w:fill="F4F7F9"/>
+          </w:tcPr>
+          <w:p>
+            <w:pPr>
+              <w:spacing w:before="0" w:after="0" w:line="252" w:lineRule="auto"/>
+              <w:jc w:val="left"/>
+            </w:pPr>
+            <w:r>
+              <w:rPr>
+                <w:rFonts w:ascii="Arial" w:hAnsi="Arial" w:eastAsia="Arial"/>
+                <w:b/>
+                <w:sz w:val="15"/>
+              </w:rPr>
+              <w:t>По разделам</w:t>
+            </w:r>
+          </w:p>
+        </w:tc>
+        <w:tc>
+          <w:tcPr>
+            <w:tcW w:type="dxa" w:w="700"/>
+            <w:shd w:fill="F4F7F9"/>
+          </w:tcPr>
+          <w:p>
+            <w:pPr>
+              <w:spacing w:before="0" w:after="0" w:line="252" w:lineRule="auto"/>
+              <w:jc w:val="center"/>
+            </w:pPr>
+            <w:r>
+              <w:rPr>
+                <w:rFonts w:ascii="Arial" w:hAnsi="Arial" w:eastAsia="Arial"/>
+                <w:b/>
+                <w:sz w:val="15"/>
+              </w:rPr>
+              <w:t>69,8</w:t>
+            </w:r>
+          </w:p>
+        </w:tc>
+        <w:tc>
+          <w:tcPr>
+            <w:tcW w:type="dxa" w:w="430"/>
+            <w:shd w:fill="F4F7F9"/>
+          </w:tcPr>
+          <w:p>
+            <w:pPr>
+              <w:spacing w:before="0" w:after="0" w:line="252" w:lineRule="auto"/>
+              <w:jc w:val="center"/>
+            </w:pPr>
+            <w:r>
+              <w:rPr>
+                <w:rFonts w:ascii="Arial" w:hAnsi="Arial" w:eastAsia="Arial"/>
+                <w:b/>
+                <w:sz w:val="15"/>
               </w:rPr>
               <w:t>16</w:t>
             </w:r>
           </w:p>
         </w:tc>
+        <w:tc>
+          <w:tcPr>
+            <w:tcW w:type="dxa" w:w="480"/>
+            <w:shd w:fill="F4F7F9"/>
+          </w:tcPr>
+          <w:p>
+            <w:pPr>
+              <w:spacing w:before="0" w:after="0" w:line="252" w:lineRule="auto"/>
+              <w:jc w:val="center"/>
+            </w:pPr>
+            <w:r>
+              <w:rPr>
+                <w:rFonts w:ascii="Arial" w:hAnsi="Arial" w:eastAsia="Arial"/>
+                <w:b/>
+                <w:sz w:val="15"/>
+              </w:rPr>
+              <w:t>16</w:t>
+            </w:r>
+          </w:p>
+        </w:tc>
+        <w:tc>
+          <w:tcPr>
+            <w:tcW w:type="dxa" w:w="600"/>
+            <w:shd w:fill="F4F7F9"/>
+          </w:tcPr>
+          <w:p>
+            <w:pPr>
+              <w:spacing w:before="0" w:after="0" w:line="252" w:lineRule="auto"/>
+              <w:jc w:val="center"/>
+            </w:pPr>
+            <w:r>
+              <w:rPr>
+                <w:rFonts w:ascii="Arial" w:hAnsi="Arial" w:eastAsia="Arial"/>
+                <w:b/>
+                <w:sz w:val="15"/>
+              </w:rPr>
+              <w:t>37,8</w:t>
+            </w:r>
+          </w:p>
+        </w:tc>
+        <w:tc>
+          <w:tcPr>
+            <w:tcW w:type="dxa" w:w="2448"/>
+            <w:shd w:fill="F4F7F9"/>
+          </w:tcPr>
+          <w:p>
+            <w:pPr>
+              <w:spacing w:before="0" w:after="0" w:line="252" w:lineRule="auto"/>
+              <w:jc w:val="center"/>
+            </w:pPr>
+            <w:r>
+              <w:rPr>
+                <w:rFonts w:ascii="Arial" w:hAnsi="Arial" w:eastAsia="Arial"/>
+                <w:b/>
+                <w:sz w:val="15"/>
+              </w:rPr>
+            </w:r>
+          </w:p>
+        </w:tc>
+        <w:tc>
+          <w:tcPr>
+            <w:tcW w:type="dxa" w:w="1150"/>
+            <w:shd w:fill="F4F7F9"/>
+          </w:tcPr>
+          <w:p>
+            <w:pPr>
+              <w:spacing w:before="0" w:after="0" w:line="252" w:lineRule="auto"/>
+              <w:jc w:val="center"/>
+            </w:pPr>
+            <w:r>
+              <w:rPr>
+                <w:rFonts w:ascii="Arial" w:hAnsi="Arial" w:eastAsia="Arial"/>
+                <w:b/>
+                <w:sz w:val="15"/>
+              </w:rPr>
+            </w:r>
+          </w:p>
+        </w:tc>
+      </w:tr>
+      <w:tr>
+        <w:trPr>
+          <w:cantSplit/>
+        </w:trPr>
         <w:tc>
           <w:tcPr>
             <w:tcW w:type="dxa" w:w="500"/>
@@ -3691,15 +4056,34 @@
               <w:rPr>
                 <w:rFonts w:ascii="Arial" w:hAnsi="Arial" w:eastAsia="Arial"/>
                 <w:b/>
-                <w:sz w:val="16"/>
+                <w:sz w:val="15"/>
               </w:rPr>
-              <w:t>16</w:t>
             </w:r>
           </w:p>
         </w:tc>
         <w:tc>
           <w:tcPr>
-            <w:tcW w:type="dxa" w:w="650"/>
+            <w:tcW w:type="dxa" w:w="3330"/>
+            <w:shd w:fill="F4F7F9"/>
+          </w:tcPr>
+          <w:p>
+            <w:pPr>
+              <w:spacing w:before="0" w:after="0" w:line="252" w:lineRule="auto"/>
+              <w:jc w:val="left"/>
+            </w:pPr>
+            <w:r>
+              <w:rPr>
+                <w:rFonts w:ascii="Arial" w:hAnsi="Arial" w:eastAsia="Arial"/>
+                <w:b/>
+                <w:sz w:val="15"/>
+              </w:rPr>
+              <w:t>Контроль самостоятельной работы</w:t>
+            </w:r>
+          </w:p>
+        </w:tc>
+        <w:tc>
+          <w:tcPr>
+            <w:tcW w:type="dxa" w:w="700"/>
             <w:shd w:fill="F4F7F9"/>
           </w:tcPr>
           <w:p>
@@ -3711,39 +4095,15 @@
               <w:rPr>
                 <w:rFonts w:ascii="Arial" w:hAnsi="Arial" w:eastAsia="Arial"/>
                 <w:b/>
-                <w:sz w:val="16"/>
+                <w:sz w:val="15"/>
               </w:rPr>
-              <w:t>37,8</w:t>
+              <w:t>2</w:t>
             </w:r>
           </w:p>
         </w:tc>
         <w:tc>
           <w:tcPr>
-            <w:tcW w:type="dxa" w:w="2518"/>
-            <w:shd w:fill="F4F7F9"/>
-          </w:tcPr>
-          <w:p>
-            <w:pPr>
-              <w:spacing w:before="0" w:after="0" w:line="252" w:lineRule="auto"/>
-              <w:jc w:val="left"/>
-            </w:pPr>
-            <w:r>
-              <w:rPr>
-                <w:rFonts w:ascii="Arial" w:hAnsi="Arial" w:eastAsia="Arial"/>
-                <w:b/>
-                <w:sz w:val="16"/>
-              </w:rPr>
-            </w:r>
-          </w:p>
-        </w:tc>
-      </w:tr>
-      <w:tr>
-        <w:trPr>
-          <w:cantSplit/>
-        </w:trPr>
-        <w:tc>
-          <w:tcPr>
-            <w:tcW w:type="dxa" w:w="420"/>
+            <w:tcW w:type="dxa" w:w="430"/>
             <w:shd w:fill="F4F7F9"/>
           </w:tcPr>
           <w:p>
@@ -3755,34 +4115,14 @@
               <w:rPr>
                 <w:rFonts w:ascii="Arial" w:hAnsi="Arial" w:eastAsia="Arial"/>
                 <w:b/>
-                <w:sz w:val="16"/>
+                <w:sz w:val="15"/>
               </w:rPr>
             </w:r>
           </w:p>
         </w:tc>
         <w:tc>
           <w:tcPr>
-            <w:tcW w:type="dxa" w:w="4300"/>
-            <w:shd w:fill="F4F7F9"/>
-          </w:tcPr>
-          <w:p>
-            <w:pPr>
-              <w:spacing w:before="0" w:after="0" w:line="252" w:lineRule="auto"/>
-              <w:jc w:val="left"/>
-            </w:pPr>
-            <w:r>
-              <w:rPr>
-                <w:rFonts w:ascii="Arial" w:hAnsi="Arial" w:eastAsia="Arial"/>
-                <w:b/>
-                <w:sz w:val="16"/>
-              </w:rPr>
-              <w:t>Контроль самостоятельной работы</w:t>
-            </w:r>
-          </w:p>
-        </w:tc>
-        <w:tc>
-          <w:tcPr>
-            <w:tcW w:type="dxa" w:w="750"/>
+            <w:tcW w:type="dxa" w:w="480"/>
             <w:shd w:fill="F4F7F9"/>
           </w:tcPr>
           <w:p>
@@ -3794,12 +4134,74 @@
               <w:rPr>
                 <w:rFonts w:ascii="Arial" w:hAnsi="Arial" w:eastAsia="Arial"/>
                 <w:b/>
-                <w:sz w:val="16"/>
+                <w:sz w:val="15"/>
               </w:rPr>
-              <w:t>2</w:t>
             </w:r>
           </w:p>
         </w:tc>
+        <w:tc>
+          <w:tcPr>
+            <w:tcW w:type="dxa" w:w="600"/>
+            <w:shd w:fill="F4F7F9"/>
+          </w:tcPr>
+          <w:p>
+            <w:pPr>
+              <w:spacing w:before="0" w:after="0" w:line="252" w:lineRule="auto"/>
+              <w:jc w:val="center"/>
+            </w:pPr>
+            <w:r>
+              <w:rPr>
+                <w:rFonts w:ascii="Arial" w:hAnsi="Arial" w:eastAsia="Arial"/>
+                <w:b/>
+                <w:sz w:val="15"/>
+              </w:rPr>
+            </w:r>
+          </w:p>
+        </w:tc>
+        <w:tc>
+          <w:tcPr>
+            <w:tcW w:type="dxa" w:w="2448"/>
+            <w:shd w:fill="F4F7F9"/>
+          </w:tcPr>
+          <w:p>
+            <w:pPr>
+              <w:spacing w:before="0" w:after="0" w:line="252" w:lineRule="auto"/>
+              <w:jc w:val="center"/>
+            </w:pPr>
+            <w:r>
+              <w:rPr>
+                <w:rFonts w:ascii="Arial" w:hAnsi="Arial" w:eastAsia="Arial"/>
+                <w:b/>
+                <w:sz w:val="15"/>
+              </w:rPr>
+              <w:t>выбранные проектом</w:t>
+            </w:r>
+          </w:p>
+        </w:tc>
+        <w:tc>
+          <w:tcPr>
+            <w:tcW w:type="dxa" w:w="1150"/>
+            <w:shd w:fill="F4F7F9"/>
+          </w:tcPr>
+          <w:p>
+            <w:pPr>
+              <w:spacing w:before="0" w:after="0" w:line="252" w:lineRule="auto"/>
+              <w:jc w:val="center"/>
+            </w:pPr>
+            <w:r>
+              <w:rPr>
+                <w:rFonts w:ascii="Arial" w:hAnsi="Arial" w:eastAsia="Arial"/>
+                <w:b/>
+                <w:sz w:val="15"/>
+              </w:rPr>
+            </w:r>
+          </w:p>
+        </w:tc>
+      </w:tr>
+      <w:tr>
+        <w:trPr>
+          <w:cantSplit/>
+        </w:trPr>
         <w:tc>
           <w:tcPr>
             <w:tcW w:type="dxa" w:w="500"/>
@@ -3814,11 +4216,152 @@
               <w:rPr>
                 <w:rFonts w:ascii="Arial" w:hAnsi="Arial" w:eastAsia="Arial"/>
                 <w:b/>
-                <w:sz w:val="16"/>
+                <w:sz w:val="15"/>
               </w:rPr>
             </w:r>
           </w:p>
         </w:tc>
+        <w:tc>
+          <w:tcPr>
+            <w:tcW w:type="dxa" w:w="3330"/>
+            <w:shd w:fill="F4F7F9"/>
+          </w:tcPr>
+          <w:p>
+            <w:pPr>
+              <w:spacing w:before="0" w:after="0" w:line="252" w:lineRule="auto"/>
+              <w:jc w:val="left"/>
+            </w:pPr>
+            <w:r>
+              <w:rPr>
+                <w:rFonts w:ascii="Arial" w:hAnsi="Arial" w:eastAsia="Arial"/>
+                <w:b/>
+                <w:sz w:val="15"/>
+              </w:rPr>
+              <w:t>Промежуточная аттестация</w:t>
+            </w:r>
+          </w:p>
+        </w:tc>
+        <w:tc>
+          <w:tcPr>
+            <w:tcW w:type="dxa" w:w="700"/>
+            <w:shd w:fill="F4F7F9"/>
+          </w:tcPr>
+          <w:p>
+            <w:pPr>
+              <w:spacing w:before="0" w:after="0" w:line="252" w:lineRule="auto"/>
+              <w:jc w:val="center"/>
+            </w:pPr>
+            <w:r>
+              <w:rPr>
+                <w:rFonts w:ascii="Arial" w:hAnsi="Arial" w:eastAsia="Arial"/>
+                <w:b/>
+                <w:sz w:val="15"/>
+              </w:rPr>
+              <w:t>0,2</w:t>
+            </w:r>
+          </w:p>
+        </w:tc>
+        <w:tc>
+          <w:tcPr>
+            <w:tcW w:type="dxa" w:w="430"/>
+            <w:shd w:fill="F4F7F9"/>
+          </w:tcPr>
+          <w:p>
+            <w:pPr>
+              <w:spacing w:before="0" w:after="0" w:line="252" w:lineRule="auto"/>
+              <w:jc w:val="center"/>
+            </w:pPr>
+            <w:r>
+              <w:rPr>
+                <w:rFonts w:ascii="Arial" w:hAnsi="Arial" w:eastAsia="Arial"/>
+                <w:b/>
+                <w:sz w:val="15"/>
+              </w:rPr>
+            </w:r>
+          </w:p>
+        </w:tc>
+        <w:tc>
+          <w:tcPr>
+            <w:tcW w:type="dxa" w:w="480"/>
+            <w:shd w:fill="F4F7F9"/>
+          </w:tcPr>
+          <w:p>
+            <w:pPr>
+              <w:spacing w:before="0" w:after="0" w:line="252" w:lineRule="auto"/>
+              <w:jc w:val="center"/>
+            </w:pPr>
+            <w:r>
+              <w:rPr>
+                <w:rFonts w:ascii="Arial" w:hAnsi="Arial" w:eastAsia="Arial"/>
+                <w:b/>
+                <w:sz w:val="15"/>
+              </w:rPr>
+            </w:r>
+          </w:p>
+        </w:tc>
+        <w:tc>
+          <w:tcPr>
+            <w:tcW w:type="dxa" w:w="600"/>
+            <w:shd w:fill="F4F7F9"/>
+          </w:tcPr>
+          <w:p>
+            <w:pPr>
+              <w:spacing w:before="0" w:after="0" w:line="252" w:lineRule="auto"/>
+              <w:jc w:val="center"/>
+            </w:pPr>
+            <w:r>
+              <w:rPr>
+                <w:rFonts w:ascii="Arial" w:hAnsi="Arial" w:eastAsia="Arial"/>
+                <w:b/>
+                <w:sz w:val="15"/>
+              </w:rPr>
+            </w:r>
+          </w:p>
+        </w:tc>
+        <w:tc>
+          <w:tcPr>
+            <w:tcW w:type="dxa" w:w="2448"/>
+            <w:shd w:fill="F4F7F9"/>
+          </w:tcPr>
+          <w:p>
+            <w:pPr>
+              <w:spacing w:before="0" w:after="0" w:line="252" w:lineRule="auto"/>
+              <w:jc w:val="center"/>
+            </w:pPr>
+            <w:r>
+              <w:rPr>
+                <w:rFonts w:ascii="Arial" w:hAnsi="Arial" w:eastAsia="Arial"/>
+                <w:b/>
+                <w:sz w:val="15"/>
+              </w:rPr>
+              <w:t>выбранные проектом</w:t>
+            </w:r>
+          </w:p>
+        </w:tc>
+        <w:tc>
+          <w:tcPr>
+            <w:tcW w:type="dxa" w:w="1150"/>
+            <w:shd w:fill="F4F7F9"/>
+          </w:tcPr>
+          <w:p>
+            <w:pPr>
+              <w:spacing w:before="0" w:after="0" w:line="252" w:lineRule="auto"/>
+              <w:jc w:val="center"/>
+            </w:pPr>
+            <w:r>
+              <w:rPr>
+                <w:rFonts w:ascii="Arial" w:hAnsi="Arial" w:eastAsia="Arial"/>
+                <w:b/>
+                <w:sz w:val="15"/>
+              </w:rPr>
+            </w:r>
+          </w:p>
+        </w:tc>
+      </w:tr>
+      <w:tr>
+        <w:trPr>
+          <w:cantSplit/>
+        </w:trPr>
         <w:tc>
           <w:tcPr>
             <w:tcW w:type="dxa" w:w="500"/>
@@ -3833,14 +4376,34 @@
               <w:rPr>
                 <w:rFonts w:ascii="Arial" w:hAnsi="Arial" w:eastAsia="Arial"/>
                 <w:b/>
-                <w:sz w:val="16"/>
+                <w:sz w:val="15"/>
               </w:rPr>
             </w:r>
           </w:p>
         </w:tc>
         <w:tc>
           <w:tcPr>
-            <w:tcW w:type="dxa" w:w="650"/>
+            <w:tcW w:type="dxa" w:w="3330"/>
+            <w:shd w:fill="F4F7F9"/>
+          </w:tcPr>
+          <w:p>
+            <w:pPr>
+              <w:spacing w:before="0" w:after="0" w:line="252" w:lineRule="auto"/>
+              <w:jc w:val="left"/>
+            </w:pPr>
+            <w:r>
+              <w:rPr>
+                <w:rFonts w:ascii="Arial" w:hAnsi="Arial" w:eastAsia="Arial"/>
+                <w:b/>
+                <w:sz w:val="15"/>
+              </w:rPr>
+              <w:t>Общая трудоёмкость</w:t>
+            </w:r>
+          </w:p>
+        </w:tc>
+        <w:tc>
+          <w:tcPr>
+            <w:tcW w:type="dxa" w:w="700"/>
             <w:shd w:fill="F4F7F9"/>
           </w:tcPr>
           <w:p>
@@ -3852,39 +4415,15 @@
               <w:rPr>
                 <w:rFonts w:ascii="Arial" w:hAnsi="Arial" w:eastAsia="Arial"/>
                 <w:b/>
-                <w:sz w:val="16"/>
+                <w:sz w:val="15"/>
               </w:rPr>
+              <w:t>72</w:t>
             </w:r>
           </w:p>
         </w:tc>
         <w:tc>
           <w:tcPr>
-            <w:tcW w:type="dxa" w:w="2518"/>
-            <w:shd w:fill="F4F7F9"/>
-          </w:tcPr>
-          <w:p>
-            <w:pPr>
-              <w:spacing w:before="0" w:after="0" w:line="252" w:lineRule="auto"/>
-              <w:jc w:val="left"/>
-            </w:pPr>
-            <w:r>
-              <w:rPr>
-                <w:rFonts w:ascii="Arial" w:hAnsi="Arial" w:eastAsia="Arial"/>
-                <w:b/>
-                <w:sz w:val="16"/>
-              </w:rPr>
-              <w:t>выбранные проектом</w:t>
-            </w:r>
-          </w:p>
-        </w:tc>
-      </w:tr>
-      <w:tr>
-        <w:trPr>
-          <w:cantSplit/>
-        </w:trPr>
-        <w:tc>
-          <w:tcPr>
-            <w:tcW w:type="dxa" w:w="420"/>
+            <w:tcW w:type="dxa" w:w="430"/>
             <w:shd w:fill="F4F7F9"/>
           </w:tcPr>
           <w:p>
@@ -3896,34 +4435,14 @@
               <w:rPr>
                 <w:rFonts w:ascii="Arial" w:hAnsi="Arial" w:eastAsia="Arial"/>
                 <w:b/>
-                <w:sz w:val="16"/>
+                <w:sz w:val="15"/>
               </w:rPr>
             </w:r>
           </w:p>
         </w:tc>
         <w:tc>
           <w:tcPr>
-            <w:tcW w:type="dxa" w:w="4300"/>
-            <w:shd w:fill="F4F7F9"/>
-          </w:tcPr>
-          <w:p>
-            <w:pPr>
-              <w:spacing w:before="0" w:after="0" w:line="252" w:lineRule="auto"/>
-              <w:jc w:val="left"/>
-            </w:pPr>
-            <w:r>
-              <w:rPr>
-                <w:rFonts w:ascii="Arial" w:hAnsi="Arial" w:eastAsia="Arial"/>
-                <w:b/>
-                <w:sz w:val="16"/>
-              </w:rPr>
-              <w:t>Промежуточная аттестация</w:t>
-            </w:r>
-          </w:p>
-        </w:tc>
-        <w:tc>
-          <w:tcPr>
-            <w:tcW w:type="dxa" w:w="750"/>
+            <w:tcW w:type="dxa" w:w="480"/>
             <w:shd w:fill="F4F7F9"/>
           </w:tcPr>
           <w:p>
@@ -3935,15 +4454,14 @@
               <w:rPr>
                 <w:rFonts w:ascii="Arial" w:hAnsi="Arial" w:eastAsia="Arial"/>
                 <w:b/>
-                <w:sz w:val="16"/>
+                <w:sz w:val="15"/>
               </w:rPr>
-              <w:t>0,2</w:t>
             </w:r>
           </w:p>
         </w:tc>
         <w:tc>
           <w:tcPr>
-            <w:tcW w:type="dxa" w:w="500"/>
+            <w:tcW w:type="dxa" w:w="600"/>
             <w:shd w:fill="F4F7F9"/>
           </w:tcPr>
           <w:p>
@@ -3955,14 +4473,14 @@
               <w:rPr>
                 <w:rFonts w:ascii="Arial" w:hAnsi="Arial" w:eastAsia="Arial"/>
                 <w:b/>
-                <w:sz w:val="16"/>
+                <w:sz w:val="15"/>
               </w:rPr>
             </w:r>
           </w:p>
         </w:tc>
         <w:tc>
           <w:tcPr>
-            <w:tcW w:type="dxa" w:w="500"/>
+            <w:tcW w:type="dxa" w:w="2448"/>
             <w:shd w:fill="F4F7F9"/>
           </w:tcPr>
           <w:p>
@@ -3974,14 +4492,14 @@
               <w:rPr>
                 <w:rFonts w:ascii="Arial" w:hAnsi="Arial" w:eastAsia="Arial"/>
                 <w:b/>
-                <w:sz w:val="16"/>
+                <w:sz w:val="15"/>
               </w:rPr>
             </w:r>
           </w:p>
         </w:tc>
         <w:tc>
           <w:tcPr>
-            <w:tcW w:type="dxa" w:w="650"/>
+            <w:tcW w:type="dxa" w:w="1150"/>
             <w:shd w:fill="F4F7F9"/>
           </w:tcPr>
           <w:p>
@@ -3993,167 +4511,7 @@
               <w:rPr>
                 <w:rFonts w:ascii="Arial" w:hAnsi="Arial" w:eastAsia="Arial"/>
                 <w:b/>
-                <w:sz w:val="16"/>
-              </w:rPr>
-            </w:r>
-          </w:p>
-        </w:tc>
-        <w:tc>
-          <w:tcPr>
-            <w:tcW w:type="dxa" w:w="2518"/>
-            <w:shd w:fill="F4F7F9"/>
-          </w:tcPr>
-          <w:p>
-            <w:pPr>
-              <w:spacing w:before="0" w:after="0" w:line="252" w:lineRule="auto"/>
-              <w:jc w:val="left"/>
-            </w:pPr>
-            <w:r>
-              <w:rPr>
-                <w:rFonts w:ascii="Arial" w:hAnsi="Arial" w:eastAsia="Arial"/>
-                <w:b/>
-                <w:sz w:val="16"/>
-              </w:rPr>
-              <w:t>выбранные проектом</w:t>
-            </w:r>
-          </w:p>
-        </w:tc>
-      </w:tr>
-      <w:tr>
-        <w:trPr>
-          <w:cantSplit/>
-        </w:trPr>
-        <w:tc>
-          <w:tcPr>
-            <w:tcW w:type="dxa" w:w="420"/>
-            <w:shd w:fill="F4F7F9"/>
-          </w:tcPr>
-          <w:p>
-            <w:pPr>
-              <w:spacing w:before="0" w:after="0" w:line="252" w:lineRule="auto"/>
-              <w:jc w:val="center"/>
-            </w:pPr>
-            <w:r>
-              <w:rPr>
-                <w:rFonts w:ascii="Arial" w:hAnsi="Arial" w:eastAsia="Arial"/>
-                <w:b/>
-                <w:sz w:val="16"/>
-              </w:rPr>
-            </w:r>
-          </w:p>
-        </w:tc>
-        <w:tc>
-          <w:tcPr>
-            <w:tcW w:type="dxa" w:w="4300"/>
-            <w:shd w:fill="F4F7F9"/>
-          </w:tcPr>
-          <w:p>
-            <w:pPr>
-              <w:spacing w:before="0" w:after="0" w:line="252" w:lineRule="auto"/>
-              <w:jc w:val="left"/>
-            </w:pPr>
-            <w:r>
-              <w:rPr>
-                <w:rFonts w:ascii="Arial" w:hAnsi="Arial" w:eastAsia="Arial"/>
-                <w:b/>
-                <w:sz w:val="16"/>
-              </w:rPr>
-              <w:t>Общая трудоёмкость</w:t>
-            </w:r>
-          </w:p>
-        </w:tc>
-        <w:tc>
-          <w:tcPr>
-            <w:tcW w:type="dxa" w:w="750"/>
-            <w:shd w:fill="F4F7F9"/>
-          </w:tcPr>
-          <w:p>
-            <w:pPr>
-              <w:spacing w:before="0" w:after="0" w:line="252" w:lineRule="auto"/>
-              <w:jc w:val="center"/>
-            </w:pPr>
-            <w:r>
-              <w:rPr>
-                <w:rFonts w:ascii="Arial" w:hAnsi="Arial" w:eastAsia="Arial"/>
-                <w:b/>
-                <w:sz w:val="16"/>
-              </w:rPr>
-              <w:t>72</w:t>
-            </w:r>
-          </w:p>
-        </w:tc>
-        <w:tc>
-          <w:tcPr>
-            <w:tcW w:type="dxa" w:w="500"/>
-            <w:shd w:fill="F4F7F9"/>
-          </w:tcPr>
-          <w:p>
-            <w:pPr>
-              <w:spacing w:before="0" w:after="0" w:line="252" w:lineRule="auto"/>
-              <w:jc w:val="center"/>
-            </w:pPr>
-            <w:r>
-              <w:rPr>
-                <w:rFonts w:ascii="Arial" w:hAnsi="Arial" w:eastAsia="Arial"/>
-                <w:b/>
-                <w:sz w:val="16"/>
-              </w:rPr>
-            </w:r>
-          </w:p>
-        </w:tc>
-        <w:tc>
-          <w:tcPr>
-            <w:tcW w:type="dxa" w:w="500"/>
-            <w:shd w:fill="F4F7F9"/>
-          </w:tcPr>
-          <w:p>
-            <w:pPr>
-              <w:spacing w:before="0" w:after="0" w:line="252" w:lineRule="auto"/>
-              <w:jc w:val="center"/>
-            </w:pPr>
-            <w:r>
-              <w:rPr>
-                <w:rFonts w:ascii="Arial" w:hAnsi="Arial" w:eastAsia="Arial"/>
-                <w:b/>
-                <w:sz w:val="16"/>
-              </w:rPr>
-            </w:r>
-          </w:p>
-        </w:tc>
-        <w:tc>
-          <w:tcPr>
-            <w:tcW w:type="dxa" w:w="650"/>
-            <w:shd w:fill="F4F7F9"/>
-          </w:tcPr>
-          <w:p>
-            <w:pPr>
-              <w:spacing w:before="0" w:after="0" w:line="252" w:lineRule="auto"/>
-              <w:jc w:val="center"/>
-            </w:pPr>
-            <w:r>
-              <w:rPr>
-                <w:rFonts w:ascii="Arial" w:hAnsi="Arial" w:eastAsia="Arial"/>
-                <w:b/>
-                <w:sz w:val="16"/>
-              </w:rPr>
-            </w:r>
-          </w:p>
-        </w:tc>
-        <w:tc>
-          <w:tcPr>
-            <w:tcW w:type="dxa" w:w="2518"/>
-            <w:shd w:fill="F4F7F9"/>
-          </w:tcPr>
-          <w:p>
-            <w:pPr>
-              <w:spacing w:before="0" w:after="0" w:line="252" w:lineRule="auto"/>
-              <w:jc w:val="left"/>
-            </w:pPr>
-            <w:r>
-              <w:rPr>
-                <w:rFonts w:ascii="Arial" w:hAnsi="Arial" w:eastAsia="Arial"/>
-                <w:b/>
-                <w:sz w:val="16"/>
+                <w:sz w:val="15"/>
               </w:rPr>
             </w:r>
           </w:p>
@@ -4164,6 +4522,29 @@
       <w:pPr>
         <w:spacing w:before="0" w:after="40"/>
       </w:pPr>
+    </w:p>
+    <w:p>
+      <w:pPr>
+        <w:spacing w:before="100" w:after="160"/>
+        <w:ind w:left="255" w:right="255"/>
+        <w:shd w:fill="F4F7F9"/>
+      </w:pPr>
+      <w:r>
+        <w:rPr>
+          <w:rFonts w:ascii="Arial" w:hAnsi="Arial" w:eastAsia="Arial"/>
+          <w:b/>
+          <w:color w:val="173B52"/>
+          <w:sz w:val="21"/>
+        </w:rPr>
+        <w:t xml:space="preserve">Уровни: </w:t>
+      </w:r>
+      <w:r>
+        <w:rPr>
+          <w:rFonts w:ascii="Arial" w:hAnsi="Arial" w:eastAsia="Arial"/>
+          <w:sz w:val="21"/>
+        </w:rPr>
+        <w:t>Б — выполнение типовой задачи с корректным применением готовых инструментов; С — самостоятельный выбор и обоснование метода, сопоставление альтернатив и анализ ограничений.</w:t>
+      </w:r>
     </w:p>
     <w:p>
       <w:pPr>

</xml_diff>